<commit_message>
feat(spm-sanitasi): auto-create infrastruktur and expand LIDA docs
Add one-click auto-create/link for SPM sanitasi infrastruktur from desa pekerjaan, plus generators and deliverable docs (panduan, proposal, SOP, timeline, kemanfaatan, integrasi, alat kerja, tiket report).
</commit_message>
<xml_diff>
--- a/docs/Proposal_Inovasi_Arumanis_LIDA_2026.docx
+++ b/docs/Proposal_Inovasi_Arumanis_LIDA_2026.docx
@@ -954,7 +954,7 @@
               <w:spacing w:before="40" w:after="40" w:line="360" w:lineRule="auto"/>
             </w:pPr>
             <w:r>
-              <w:t>Desember</w:t>
+              <w:t>Januari</w:t>
             </w:r>
             <w:r>
               <w:t xml:space="preserve"> 2024</w:t>
@@ -1017,7 +1017,13 @@
               <w:spacing w:before="40" w:after="40" w:line="360" w:lineRule="auto"/>
             </w:pPr>
             <w:r>
-              <w:t>Januari 2025</w:t>
+              <w:t>April</w:t>
+            </w:r>
+            <w:r>
+              <w:t xml:space="preserve"> </w:t>
+            </w:r>
+            <w:r>
+              <w:t>2024</w:t>
             </w:r>
           </w:p>
         </w:tc>

</xml_diff>

<commit_message>
feat(foto): tampilkan dan filter foto koordinat invalid di tab detail pekerjaan
Tambah helper status koordinat, banner/filter di FotoTabContent, highlight GPS invalid, serta unit test. Sertakan skrip dan dokumen LIDA/monev: baseline legacy repo, pengukuran efisiensi live, kajian monev, dan proposal 2026 yang diperbarui.
</commit_message>
<xml_diff>
--- a/docs/Proposal_Inovasi_Arumanis_LIDA_2026.docx
+++ b/docs/Proposal_Inovasi_Arumanis_LIDA_2026.docx
@@ -546,9 +546,9 @@
             <w:r>
               <w:rPr>
                 <w:rFonts w:eastAsia="Times New Roman" w:cs="Times New Roman"/>
+                <w:color w:val="1A1A1A"/>
                 <w:i/>
                 <w:iCs/>
-                <w:color w:val="1A1A1A"/>
               </w:rPr>
               <w:t>Digital</w:t>
             </w:r>
@@ -571,9 +571,9 @@
             <w:r>
               <w:rPr>
                 <w:rFonts w:eastAsia="Times New Roman" w:cs="Times New Roman"/>
+                <w:color w:val="1A1A1A"/>
                 <w:i/>
                 <w:iCs/>
-                <w:color w:val="1A1A1A"/>
               </w:rPr>
               <w:t>Digital</w:t>
             </w:r>
@@ -681,21 +681,7 @@
                 <w:rFonts w:eastAsia="Times New Roman" w:cs="Times New Roman"/>
                 <w:color w:val="1A1A1A"/>
               </w:rPr>
-              <w:t>(</w:t>
-            </w:r>
-            <w:r>
-              <w:rPr>
-                <w:rFonts w:eastAsia="Times New Roman" w:cs="Times New Roman"/>
-                <w:color w:val="1A1A1A"/>
-              </w:rPr>
-              <w:t xml:space="preserve"> x </w:t>
-            </w:r>
-            <w:r>
-              <w:rPr>
-                <w:rFonts w:eastAsia="Times New Roman" w:cs="Times New Roman"/>
-                <w:color w:val="1A1A1A"/>
-              </w:rPr>
-              <w:t>) Diterapkan</w:t>
+              <w:t>(   ) Diterapkan</w:t>
             </w:r>
           </w:p>
         </w:tc>
@@ -729,7 +715,6 @@
                 <w:bCs/>
                 <w:color w:val="1A1A1A"/>
               </w:rPr>
-              <w:lastRenderedPageBreak/>
               <w:t>Titik Koordinat</w:t>
             </w:r>
           </w:p>
@@ -860,6 +845,7 @@
                 <w:bCs/>
                 <w:color w:val="1A1A1A"/>
               </w:rPr>
+              <w:lastRenderedPageBreak/>
               <w:t>Urusan pemerintahan</w:t>
             </w:r>
           </w:p>
@@ -954,10 +940,7 @@
               <w:spacing w:before="40" w:after="40" w:line="360" w:lineRule="auto"/>
             </w:pPr>
             <w:r>
-              <w:t>Januari</w:t>
-            </w:r>
-            <w:r>
-              <w:t xml:space="preserve"> 2024</w:t>
+              <w:t>9 Januari 2024</w:t>
             </w:r>
           </w:p>
         </w:tc>
@@ -1017,13 +1000,7 @@
               <w:spacing w:before="40" w:after="40" w:line="360" w:lineRule="auto"/>
             </w:pPr>
             <w:r>
-              <w:t>April</w:t>
-            </w:r>
-            <w:r>
-              <w:t xml:space="preserve"> </w:t>
-            </w:r>
-            <w:r>
-              <w:t>2024</w:t>
+              <w:t>15 April 2024</w:t>
             </w:r>
           </w:p>
         </w:tc>
@@ -1082,6 +1059,9 @@
             <w:pPr>
               <w:spacing w:before="40" w:after="40" w:line="360" w:lineRule="auto"/>
             </w:pPr>
+            <w:r>
+              <w:t>22 Desember 2025</w:t>
+            </w:r>
           </w:p>
         </w:tc>
       </w:tr>
@@ -1105,7 +1085,14 @@
         <w:rPr>
           <w:lang w:val="en-ID"/>
         </w:rPr>
-        <w:t>BAGIAN II:  RANCANG BANGUN INOVASI</w:t>
+        <w:t xml:space="preserve">BAGIAN II :  RANCANG BANGUN INOVASI </w:t>
+      </w:r>
+      <w:r>
+        <w:rPr>
+          <w:color w:val="EE0000"/>
+          <w:lang w:val="en-ID"/>
+        </w:rPr>
+        <w:t>(minimal 300 kata)</w:t>
       </w:r>
     </w:p>
     <w:p>
@@ -1118,21 +1105,22 @@
     </w:p>
     <w:p>
       <w:pPr>
-        <w:spacing w:before="40" w:line="360" w:lineRule="auto"/>
-      </w:pPr>
-      <w:r>
-        <w:rPr>
-          <w:rFonts w:eastAsia="Times New Roman" w:cs="Times New Roman"/>
-          <w:color w:val="1A1A1A"/>
-        </w:rPr>
-        <w:t>Inovasi Arumanis berlandaskan Undang-Undang Nomor 17 Tahun 2019 tentang Sumber Daya Air; Undang-Undang Nomor 23 Tahun 2014 tentang Pemerintahan Daerah; Undang-Undang Nomor 11 Tahun 2008 tentang Informasi dan Transaksi Elektronik; Undang-Undang Nomor 14 Tahun 2008 tentang Keterbukaan Informasi Publik; serta Undang-Undang Nomor 18 Tahun 2008 tentang Pengelolaan Sampah. Bidang air minum: Peraturan Pemerintah Nomor 16 Tahun 2005 tentang Pengembangan Sistem Penyediaan Air Minum (</w:t>
-      </w:r>
-      <w:r>
-        <w:rPr>
-          <w:rFonts w:eastAsia="Times New Roman" w:cs="Times New Roman"/>
-          <w:i/>
-          <w:iCs/>
-          <w:color w:val="1A1A1A"/>
+        <w:spacing w:before="40" w:after="160" w:line="360" w:lineRule="auto"/>
+        <w:jc w:val="both"/>
+      </w:pPr>
+      <w:r>
+        <w:rPr>
+          <w:rFonts w:eastAsia="Times New Roman" w:cs="Times New Roman"/>
+          <w:color w:val="1A1A1A"/>
+        </w:rPr>
+        <w:t>Landasan utama: Undang-Undang Nomor 23 Tahun 2014 tentang Pemerintahan Daerah (urusan perumahan dan kawasan permukiman); Undang-Undang Nomor 17 Tahun 2019 tentang Sumber Daya Air; Peraturan Pemerintah Nomor 16 Tahun 2005 tentang Pengembangan Sistem Penyediaan Air Minum (</w:t>
+      </w:r>
+      <w:r>
+        <w:rPr>
+          <w:rFonts w:eastAsia="Times New Roman" w:cs="Times New Roman"/>
+          <w:color w:val="1A1A1A"/>
+          <w:i/>
+          <w:iCs/>
         </w:rPr>
         <w:t>SPAM</w:t>
       </w:r>
@@ -1141,14 +1129,30 @@
           <w:rFonts w:eastAsia="Times New Roman" w:cs="Times New Roman"/>
           <w:color w:val="1A1A1A"/>
         </w:rPr>
-        <w:t>); Permen PUPR Nomor 18/PRT/M/2007; Permen PU Nomor 20 Tahun 2006. Bidang sanitasi: Permen PUPR Nomor 14/PRT/M/2014 (</w:t>
-      </w:r>
-      <w:r>
-        <w:rPr>
-          <w:rFonts w:eastAsia="Times New Roman" w:cs="Times New Roman"/>
-          <w:i/>
-          <w:iCs/>
-          <w:color w:val="1A1A1A"/>
+        <w:t xml:space="preserve">); Permenkes Nomor 2 Tahun 2023 tentang Standar Pelayanan Minimum (SPM) Bidang Kesehatan; serta kerangka </w:t>
+      </w:r>
+      <w:r>
+        <w:rPr>
+          <w:rFonts w:eastAsia="Times New Roman" w:cs="Times New Roman"/>
+          <w:color w:val="1A1A1A"/>
+          <w:i/>
+          <w:iCs/>
+        </w:rPr>
+        <w:t>SPBE</w:t>
+      </w:r>
+      <w:r>
+        <w:rPr>
+          <w:rFonts w:eastAsia="Times New Roman" w:cs="Times New Roman"/>
+          <w:color w:val="1A1A1A"/>
+        </w:rPr>
+        <w:t xml:space="preserve"> (Permendagri terkait tata kelola pemerintahan berbasis elektronik) dan Undang-Undang Nomor 14 Tahun 2008 tentang Keterbukaan Informasi Publik untuk publikasi capaian. Tingkat daerah: Perbup Kabupaten Cianjur Nomor 102 Tahun 2021 (tugas–fungsi DPKP), Perbup Nomor 23 Tahun 2020 (RAD </w:t>
+      </w:r>
+      <w:r>
+        <w:rPr>
+          <w:rFonts w:eastAsia="Times New Roman" w:cs="Times New Roman"/>
+          <w:color w:val="1A1A1A"/>
+          <w:i/>
+          <w:iCs/>
         </w:rPr>
         <w:t>PAMSIMAS</w:t>
       </w:r>
@@ -1157,62 +1161,14 @@
           <w:rFonts w:eastAsia="Times New Roman" w:cs="Times New Roman"/>
           <w:color w:val="1A1A1A"/>
         </w:rPr>
-        <w:t xml:space="preserve">); Permenkes Nomor 2 Tahun 2023 tentang SPM Bidang Kesehatan; Permen PUPR Nomor 27/PRT/M/2018. Tata kelola </w:t>
-      </w:r>
-      <w:r>
-        <w:rPr>
-          <w:rFonts w:eastAsia="Times New Roman" w:cs="Times New Roman"/>
-          <w:i/>
-          <w:iCs/>
-          <w:color w:val="1A1A1A"/>
-        </w:rPr>
-        <w:t>digital</w:t>
-      </w:r>
-      <w:r>
-        <w:rPr>
-          <w:rFonts w:eastAsia="Times New Roman" w:cs="Times New Roman"/>
-          <w:color w:val="1A1A1A"/>
-        </w:rPr>
-        <w:t xml:space="preserve">: Permendagri Nomor 59 Tahun 2016 tentang Penerapan </w:t>
-      </w:r>
-      <w:r>
-        <w:rPr>
-          <w:rFonts w:eastAsia="Times New Roman" w:cs="Times New Roman"/>
-          <w:i/>
-          <w:iCs/>
-          <w:color w:val="1A1A1A"/>
-        </w:rPr>
-        <w:t>SPBE</w:t>
-      </w:r>
-      <w:r>
-        <w:rPr>
-          <w:rFonts w:eastAsia="Times New Roman" w:cs="Times New Roman"/>
-          <w:color w:val="1A1A1A"/>
-        </w:rPr>
-        <w:t xml:space="preserve">; Permendagri Nomor 108 Tahun 2016. Tingkat daerah: Perda Kabupaten Cianjur Nomor 14 Tahun 2021; Perbup Nomor 102 Tahun 2021 (tugas-fungsi DPKP); Perbup Nomor 23 Tahun 2020 (RAD </w:t>
-      </w:r>
-      <w:r>
-        <w:rPr>
-          <w:rFonts w:eastAsia="Times New Roman" w:cs="Times New Roman"/>
-          <w:i/>
-          <w:iCs/>
-          <w:color w:val="1A1A1A"/>
-        </w:rPr>
-        <w:t>PAMSIMAS</w:t>
-      </w:r>
-      <w:r>
-        <w:rPr>
-          <w:rFonts w:eastAsia="Times New Roman" w:cs="Times New Roman"/>
-          <w:color w:val="1A1A1A"/>
-        </w:rPr>
-        <w:t xml:space="preserve">); </w:t>
-      </w:r>
-      <w:r>
-        <w:rPr>
-          <w:rFonts w:eastAsia="Times New Roman" w:cs="Times New Roman"/>
-          <w:i/>
-          <w:iCs/>
-          <w:color w:val="1A1A1A"/>
+        <w:t xml:space="preserve">), </w:t>
+      </w:r>
+      <w:r>
+        <w:rPr>
+          <w:rFonts w:eastAsia="Times New Roman" w:cs="Times New Roman"/>
+          <w:color w:val="1A1A1A"/>
+          <w:i/>
+          <w:iCs/>
         </w:rPr>
         <w:t>RPJMD</w:t>
       </w:r>
@@ -1221,14 +1177,14 @@
           <w:rFonts w:eastAsia="Times New Roman" w:cs="Times New Roman"/>
           <w:color w:val="1A1A1A"/>
         </w:rPr>
-        <w:t xml:space="preserve"> 2025–2029; Kajian </w:t>
-      </w:r>
-      <w:r>
-        <w:rPr>
-          <w:rFonts w:eastAsia="Times New Roman" w:cs="Times New Roman"/>
-          <w:i/>
-          <w:iCs/>
-          <w:color w:val="1A1A1A"/>
+        <w:t xml:space="preserve"> 2025–2029, dan Kajian </w:t>
+      </w:r>
+      <w:r>
+        <w:rPr>
+          <w:rFonts w:eastAsia="Times New Roman" w:cs="Times New Roman"/>
+          <w:color w:val="1A1A1A"/>
+          <w:i/>
+          <w:iCs/>
         </w:rPr>
         <w:t>RISPAM</w:t>
       </w:r>
@@ -1237,7 +1193,39 @@
           <w:rFonts w:eastAsia="Times New Roman" w:cs="Times New Roman"/>
           <w:color w:val="1A1A1A"/>
         </w:rPr>
-        <w:t xml:space="preserve"> Kabupaten Cianjur.</w:t>
+        <w:t xml:space="preserve"> Kabupaten Cianjur. Perlindungan data mengikuti prinsip minimasi akses (hak per peran), sesi </w:t>
+      </w:r>
+      <w:r>
+        <w:rPr>
+          <w:rFonts w:eastAsia="Times New Roman" w:cs="Times New Roman"/>
+          <w:color w:val="1A1A1A"/>
+          <w:i/>
+          <w:iCs/>
+        </w:rPr>
+        <w:t>httpOnly</w:t>
+      </w:r>
+      <w:r>
+        <w:rPr>
+          <w:rFonts w:eastAsia="Times New Roman" w:cs="Times New Roman"/>
+          <w:color w:val="1A1A1A"/>
+        </w:rPr>
+        <w:t xml:space="preserve">, dan jejak </w:t>
+      </w:r>
+      <w:r>
+        <w:rPr>
+          <w:rFonts w:eastAsia="Times New Roman" w:cs="Times New Roman"/>
+          <w:color w:val="1A1A1A"/>
+          <w:i/>
+          <w:iCs/>
+        </w:rPr>
+        <w:t>audit log</w:t>
+      </w:r>
+      <w:r>
+        <w:rPr>
+          <w:rFonts w:eastAsia="Times New Roman" w:cs="Times New Roman"/>
+          <w:color w:val="1A1A1A"/>
+        </w:rPr>
+        <w:t xml:space="preserve"> internal.</w:t>
       </w:r>
     </w:p>
     <w:p>
@@ -1245,27 +1233,27 @@
         <w:pStyle w:val="bagian2"/>
       </w:pPr>
       <w:r>
-        <w:lastRenderedPageBreak/>
         <w:t>Permasalahan</w:t>
       </w:r>
     </w:p>
     <w:p>
       <w:pPr>
-        <w:spacing w:before="40" w:line="360" w:lineRule="auto"/>
-      </w:pPr>
-      <w:r>
-        <w:rPr>
-          <w:rFonts w:eastAsia="Times New Roman" w:cs="Times New Roman"/>
-          <w:color w:val="1A1A1A"/>
-        </w:rPr>
-        <w:t xml:space="preserve">Permasalahan makro: Kabupaten Cianjur dengan 2.535.002 jiwa penduduk di 33 kecamatan dan 365 desa masih menghadapi kesenjangan akses air minum layak dan sanitasi. Per 29 Juni 2026, capaian Standar Pelayanan Minimum (SPM) air minum 13,25% (481.746 KK belum terlayani) dan sanitasi 1,90% (261 desa belum berinfrastruktur terpetakan). Permasalahan mikro: pemantauan progres fisik, keuangan, dan dokumentasi lapangan dilakukan manual melalui </w:t>
-      </w:r>
-      <w:r>
-        <w:rPr>
-          <w:rFonts w:eastAsia="Times New Roman" w:cs="Times New Roman"/>
-          <w:i/>
-          <w:iCs/>
-          <w:color w:val="1A1A1A"/>
+        <w:spacing w:before="40" w:after="160" w:line="360" w:lineRule="auto"/>
+        <w:jc w:val="both"/>
+      </w:pPr>
+      <w:r>
+        <w:rPr>
+          <w:rFonts w:eastAsia="Times New Roman" w:cs="Times New Roman"/>
+          <w:color w:val="1A1A1A"/>
+        </w:rPr>
+        <w:t xml:space="preserve">Makro: Kabupaten Cianjur berpenduduk 2.535.002 jiwa (33 kecamatan, 365 desa/kelurahan) masih menghadapi kesenjangan akses air minum layak dan sanitasi. Per 08 Juli 2026, capaian Standar Pelayanan Minimum (SPM) air minum 13,26% (481.703 KK belum terlayani) dan sanitasi 1,92% (255 desa belum berinfrastruktur terpetakan). Mikro (tata kelola data): (1) progres fisik–keuangan–dokumentasi lapangan tercecer di </w:t>
+      </w:r>
+      <w:r>
+        <w:rPr>
+          <w:rFonts w:eastAsia="Times New Roman" w:cs="Times New Roman"/>
+          <w:color w:val="1A1A1A"/>
+          <w:i/>
+          <w:iCs/>
         </w:rPr>
         <w:t>Excel</w:t>
       </w:r>
@@ -1279,9 +1267,9 @@
       <w:r>
         <w:rPr>
           <w:rFonts w:eastAsia="Times New Roman" w:cs="Times New Roman"/>
-          <w:i/>
-          <w:iCs/>
-          <w:color w:val="1A1A1A"/>
+          <w:color w:val="1A1A1A"/>
+          <w:i/>
+          <w:iCs/>
         </w:rPr>
         <w:t>PDF</w:t>
       </w:r>
@@ -1295,9 +1283,9 @@
       <w:r>
         <w:rPr>
           <w:rFonts w:eastAsia="Times New Roman" w:cs="Times New Roman"/>
-          <w:i/>
-          <w:iCs/>
-          <w:color w:val="1A1A1A"/>
+          <w:color w:val="1A1A1A"/>
+          <w:i/>
+          <w:iCs/>
         </w:rPr>
         <w:t>WhatsApp</w:t>
       </w:r>
@@ -1306,7 +1294,39 @@
           <w:rFonts w:eastAsia="Times New Roman" w:cs="Times New Roman"/>
           <w:color w:val="1A1A1A"/>
         </w:rPr>
-        <w:t>, dan berkas fisik tanpa jejak terpusat. Rekapitulasi capaian SPM lintas 365 desa memakan 5–10 hari kerja. Data historis sejak 2017 tersebar di berbagai format dan belum sepenuhnya terharmonisasi.</w:t>
+        <w:t xml:space="preserve">, dan berkas fisik tanpa </w:t>
+      </w:r>
+      <w:r>
+        <w:rPr>
+          <w:rFonts w:eastAsia="Times New Roman" w:cs="Times New Roman"/>
+          <w:color w:val="1A1A1A"/>
+          <w:i/>
+          <w:iCs/>
+        </w:rPr>
+        <w:t>single source of truth</w:t>
+      </w:r>
+      <w:r>
+        <w:rPr>
+          <w:rFonts w:eastAsia="Times New Roman" w:cs="Times New Roman"/>
+          <w:color w:val="1A1A1A"/>
+        </w:rPr>
+        <w:t xml:space="preserve">; (2) rekapitulasi Standar Pelayanan Minimum (SPM) lintas 365 desa memakan 5–10 hari kerja, sehingga keputusan pimpinan sering berbasis data yang sudah usang; (3) laporan pengawas 14–28 hari (manual; titik tengah 21 hari), sulit mendeteksi </w:t>
+      </w:r>
+      <w:r>
+        <w:rPr>
+          <w:rFonts w:eastAsia="Times New Roman" w:cs="Times New Roman"/>
+          <w:color w:val="1A1A1A"/>
+          <w:i/>
+          <w:iCs/>
+        </w:rPr>
+        <w:t>deviasi</w:t>
+      </w:r>
+      <w:r>
+        <w:rPr>
+          <w:rFonts w:eastAsia="Times New Roman" w:cs="Times New Roman"/>
+          <w:color w:val="1A1A1A"/>
+        </w:rPr>
+        <w:t xml:space="preserve"> dini; (4) arsip foto dan capaian historis sejak 2017 belum terharmonisasi, sehingga verifikasi lapangan dan pelaporan lintas unit lambat dan rawan tumpang tindih.</w:t>
       </w:r>
     </w:p>
     <w:p>
@@ -1319,21 +1339,22 @@
     </w:p>
     <w:p>
       <w:pPr>
-        <w:spacing w:before="40" w:line="360" w:lineRule="auto"/>
-      </w:pPr>
-      <w:r>
-        <w:rPr>
-          <w:rFonts w:eastAsia="Times New Roman" w:cs="Times New Roman"/>
-          <w:color w:val="1A1A1A"/>
-        </w:rPr>
-        <w:t xml:space="preserve">Arumanis mendukung </w:t>
-      </w:r>
-      <w:r>
-        <w:rPr>
-          <w:rFonts w:eastAsia="Times New Roman" w:cs="Times New Roman"/>
-          <w:i/>
-          <w:iCs/>
-          <w:color w:val="1A1A1A"/>
+        <w:spacing w:before="40" w:after="160" w:line="360" w:lineRule="auto"/>
+        <w:jc w:val="both"/>
+      </w:pPr>
+      <w:r>
+        <w:rPr>
+          <w:rFonts w:eastAsia="Times New Roman" w:cs="Times New Roman"/>
+          <w:color w:val="1A1A1A"/>
+        </w:rPr>
+        <w:t>Arumanis menjawab isu strategis akses air minum dan sanitasi (</w:t>
+      </w:r>
+      <w:r>
+        <w:rPr>
+          <w:rFonts w:eastAsia="Times New Roman" w:cs="Times New Roman"/>
+          <w:color w:val="1A1A1A"/>
+          <w:i/>
+          <w:iCs/>
         </w:rPr>
         <w:t>SDGs</w:t>
       </w:r>
@@ -1342,14 +1363,46 @@
           <w:rFonts w:eastAsia="Times New Roman" w:cs="Times New Roman"/>
           <w:color w:val="1A1A1A"/>
         </w:rPr>
-        <w:t xml:space="preserve"> 6 (air bersih dan sanitasi layak), Asta Cita terkait penurunan stunting, serta reformasi birokrasi melalui digitalisasi </w:t>
-      </w:r>
-      <w:r>
-        <w:rPr>
-          <w:rFonts w:eastAsia="Times New Roman" w:cs="Times New Roman"/>
-          <w:i/>
-          <w:iCs/>
-          <w:color w:val="1A1A1A"/>
+        <w:t xml:space="preserve"> 6) yang berkaitan dengan penurunan stunting (Asta Cita) melalui data cakupan layanan yang terukur per desa. Secara nasional, inovasi mendukung arah </w:t>
+      </w:r>
+      <w:r>
+        <w:rPr>
+          <w:rFonts w:eastAsia="Times New Roman" w:cs="Times New Roman"/>
+          <w:color w:val="1A1A1A"/>
+          <w:i/>
+          <w:iCs/>
+        </w:rPr>
+        <w:t>RPJMN</w:t>
+      </w:r>
+      <w:r>
+        <w:rPr>
+          <w:rFonts w:eastAsia="Times New Roman" w:cs="Times New Roman"/>
+          <w:color w:val="1A1A1A"/>
+        </w:rPr>
+        <w:t xml:space="preserve">, program </w:t>
+      </w:r>
+      <w:r>
+        <w:rPr>
+          <w:rFonts w:eastAsia="Times New Roman" w:cs="Times New Roman"/>
+          <w:color w:val="1A1A1A"/>
+          <w:i/>
+          <w:iCs/>
+        </w:rPr>
+        <w:t>PAMSIMAS</w:t>
+      </w:r>
+      <w:r>
+        <w:rPr>
+          <w:rFonts w:eastAsia="Times New Roman" w:cs="Times New Roman"/>
+          <w:color w:val="1A1A1A"/>
+        </w:rPr>
+        <w:t xml:space="preserve">, dan digitalisasi </w:t>
+      </w:r>
+      <w:r>
+        <w:rPr>
+          <w:rFonts w:eastAsia="Times New Roman" w:cs="Times New Roman"/>
+          <w:color w:val="1A1A1A"/>
+          <w:i/>
+          <w:iCs/>
         </w:rPr>
         <w:t>SPBE</w:t>
       </w:r>
@@ -1358,30 +1411,46 @@
           <w:rFonts w:eastAsia="Times New Roman" w:cs="Times New Roman"/>
           <w:color w:val="1A1A1A"/>
         </w:rPr>
-        <w:t xml:space="preserve">. Di tingkat nasional, inovasi selaras </w:t>
-      </w:r>
-      <w:r>
-        <w:rPr>
-          <w:rFonts w:eastAsia="Times New Roman" w:cs="Times New Roman"/>
-          <w:i/>
-          <w:iCs/>
-          <w:color w:val="1A1A1A"/>
-        </w:rPr>
-        <w:t>RPJMN</w:t>
-      </w:r>
-      <w:r>
-        <w:rPr>
-          <w:rFonts w:eastAsia="Times New Roman" w:cs="Times New Roman"/>
-          <w:color w:val="1A1A1A"/>
-        </w:rPr>
-        <w:t xml:space="preserve"> dan program </w:t>
-      </w:r>
-      <w:r>
-        <w:rPr>
-          <w:rFonts w:eastAsia="Times New Roman" w:cs="Times New Roman"/>
-          <w:i/>
-          <w:iCs/>
-          <w:color w:val="1A1A1A"/>
+        <w:t xml:space="preserve">. Di Kabupaten Cianjur, inovasi menopang </w:t>
+      </w:r>
+      <w:r>
+        <w:rPr>
+          <w:rFonts w:eastAsia="Times New Roman" w:cs="Times New Roman"/>
+          <w:color w:val="1A1A1A"/>
+          <w:i/>
+          <w:iCs/>
+        </w:rPr>
+        <w:t>RPJMD</w:t>
+      </w:r>
+      <w:r>
+        <w:rPr>
+          <w:rFonts w:eastAsia="Times New Roman" w:cs="Times New Roman"/>
+          <w:color w:val="1A1A1A"/>
+        </w:rPr>
+        <w:t xml:space="preserve"> 2025–2029, </w:t>
+      </w:r>
+      <w:r>
+        <w:rPr>
+          <w:rFonts w:eastAsia="Times New Roman" w:cs="Times New Roman"/>
+          <w:color w:val="1A1A1A"/>
+          <w:i/>
+          <w:iCs/>
+        </w:rPr>
+        <w:t>RISPAM</w:t>
+      </w:r>
+      <w:r>
+        <w:rPr>
+          <w:rFonts w:eastAsia="Times New Roman" w:cs="Times New Roman"/>
+          <w:color w:val="1A1A1A"/>
+        </w:rPr>
+        <w:t xml:space="preserve">, dan RAD </w:t>
+      </w:r>
+      <w:r>
+        <w:rPr>
+          <w:rFonts w:eastAsia="Times New Roman" w:cs="Times New Roman"/>
+          <w:color w:val="1A1A1A"/>
+          <w:i/>
+          <w:iCs/>
         </w:rPr>
         <w:t>PAMSIMAS</w:t>
       </w:r>
@@ -1390,55 +1459,23 @@
           <w:rFonts w:eastAsia="Times New Roman" w:cs="Times New Roman"/>
           <w:color w:val="1A1A1A"/>
         </w:rPr>
-        <w:t xml:space="preserve">. Di tingkat daerah, inovasi mendukung </w:t>
-      </w:r>
-      <w:r>
-        <w:rPr>
-          <w:rFonts w:eastAsia="Times New Roman" w:cs="Times New Roman"/>
-          <w:i/>
-          <w:iCs/>
-          <w:color w:val="1A1A1A"/>
-        </w:rPr>
-        <w:t>RPJMD</w:t>
-      </w:r>
-      <w:r>
-        <w:rPr>
-          <w:rFonts w:eastAsia="Times New Roman" w:cs="Times New Roman"/>
-          <w:color w:val="1A1A1A"/>
-        </w:rPr>
-        <w:t xml:space="preserve"> 2025–2029, </w:t>
-      </w:r>
-      <w:r>
-        <w:rPr>
-          <w:rFonts w:eastAsia="Times New Roman" w:cs="Times New Roman"/>
-          <w:i/>
-          <w:iCs/>
-          <w:color w:val="1A1A1A"/>
-        </w:rPr>
-        <w:t>RISPAM</w:t>
-      </w:r>
-      <w:r>
-        <w:rPr>
-          <w:rFonts w:eastAsia="Times New Roman" w:cs="Times New Roman"/>
-          <w:color w:val="1A1A1A"/>
-        </w:rPr>
-        <w:t xml:space="preserve"> Kabupaten Cianjur, RAD </w:t>
-      </w:r>
-      <w:r>
-        <w:rPr>
-          <w:rFonts w:eastAsia="Times New Roman" w:cs="Times New Roman"/>
-          <w:i/>
-          <w:iCs/>
-          <w:color w:val="1A1A1A"/>
-        </w:rPr>
-        <w:t>PAMSIMAS</w:t>
-      </w:r>
-      <w:r>
-        <w:rPr>
-          <w:rFonts w:eastAsia="Times New Roman" w:cs="Times New Roman"/>
-          <w:color w:val="1A1A1A"/>
-        </w:rPr>
-        <w:t>, serta prioritas peningkatan cakupan layanan air minum dan sanitasi di 365 desa/kelurahan.</w:t>
+        <w:t xml:space="preserve"> dengan menyatukan rantai data: perencanaan–kontrak–pengawasan lapangan–capaian Standar Pelayanan Minimum (SPM)–informasi publik. Tanpa rantai ini, investasi fisik sulit dievaluasi dampaknya terhadap penutupan </w:t>
+      </w:r>
+      <w:r>
+        <w:rPr>
+          <w:rFonts w:eastAsia="Times New Roman" w:cs="Times New Roman"/>
+          <w:color w:val="1A1A1A"/>
+          <w:i/>
+          <w:iCs/>
+        </w:rPr>
+        <w:t>gap</w:t>
+      </w:r>
+      <w:r>
+        <w:rPr>
+          <w:rFonts w:eastAsia="Times New Roman" w:cs="Times New Roman"/>
+          <w:color w:val="1A1A1A"/>
+        </w:rPr>
+        <w:t xml:space="preserve"> layanan di 365 desa.</w:t>
       </w:r>
     </w:p>
     <w:p>
@@ -1451,21 +1488,54 @@
     </w:p>
     <w:p>
       <w:pPr>
-        <w:spacing w:before="40" w:line="360" w:lineRule="auto"/>
-      </w:pPr>
-      <w:r>
-        <w:rPr>
-          <w:rFonts w:eastAsia="Times New Roman" w:cs="Times New Roman"/>
-          <w:color w:val="1A1A1A"/>
-        </w:rPr>
-        <w:t>Metode pembaharuan dilakukan dengan membandingkan kondisi sebelum dan sesudah penerapan Arumanis. Sebelum inovasi: data progres tersebar dalam 4–6 format (</w:t>
-      </w:r>
-      <w:r>
-        <w:rPr>
-          <w:rFonts w:eastAsia="Times New Roman" w:cs="Times New Roman"/>
-          <w:i/>
-          <w:iCs/>
-          <w:color w:val="1A1A1A"/>
+        <w:spacing w:before="40" w:after="160" w:line="360" w:lineRule="auto"/>
+        <w:jc w:val="both"/>
+      </w:pPr>
+      <w:r>
+        <w:rPr>
+          <w:rFonts w:eastAsia="Times New Roman" w:cs="Times New Roman"/>
+          <w:color w:val="1A1A1A"/>
+        </w:rPr>
+        <w:t xml:space="preserve">Pembaharuan diukur dengan metode hibrida sebelum–sesudah. SEBELUM (rekonstruksi proses yang diperkuat artefak repositori publik legacy: Database Sanitasi/sandb 2022 dan AMS Pro/amspro sejak Mei 2024—membuktikan fragmentasi multi-aplikasi tanpa unit </w:t>
+      </w:r>
+      <w:r>
+        <w:rPr>
+          <w:rFonts w:eastAsia="Times New Roman" w:cs="Times New Roman"/>
+          <w:color w:val="1A1A1A"/>
+          <w:i/>
+          <w:iCs/>
+        </w:rPr>
+        <w:t>SPAM</w:t>
+      </w:r>
+      <w:r>
+        <w:rPr>
+          <w:rFonts w:eastAsia="Times New Roman" w:cs="Times New Roman"/>
+          <w:color w:val="1A1A1A"/>
+        </w:rPr>
+        <w:t xml:space="preserve">/rekap Standar Pelayanan Minimum (SPM) terpadu; </w:t>
+      </w:r>
+      <w:r>
+        <w:rPr>
+          <w:rFonts w:eastAsia="Times New Roman" w:cs="Times New Roman"/>
+          <w:color w:val="1A1A1A"/>
+          <w:i/>
+          <w:iCs/>
+        </w:rPr>
+        <w:t>audit log</w:t>
+      </w:r>
+      <w:r>
+        <w:rPr>
+          <w:rFonts w:eastAsia="Times New Roman" w:cs="Times New Roman"/>
+          <w:color w:val="1A1A1A"/>
+        </w:rPr>
+        <w:t xml:space="preserve"> Arumanis baru aktif sejak 2025-12-29): rekap Standar Pelayanan Minimum (SPM) lintas sistem 5–10 hari kerja (titik tengah 7,5 HK); interval laporan pengawas 14–28 hari (manual; titik tengah 21 hari); data di </w:t>
+      </w:r>
+      <w:r>
+        <w:rPr>
+          <w:rFonts w:eastAsia="Times New Roman" w:cs="Times New Roman"/>
+          <w:color w:val="1A1A1A"/>
+          <w:i/>
+          <w:iCs/>
         </w:rPr>
         <w:t>Excel</w:t>
       </w:r>
@@ -1474,14 +1544,14 @@
           <w:rFonts w:eastAsia="Times New Roman" w:cs="Times New Roman"/>
           <w:color w:val="1A1A1A"/>
         </w:rPr>
-        <w:t xml:space="preserve">, </w:t>
-      </w:r>
-      <w:r>
-        <w:rPr>
-          <w:rFonts w:eastAsia="Times New Roman" w:cs="Times New Roman"/>
-          <w:i/>
-          <w:iCs/>
-          <w:color w:val="1A1A1A"/>
+        <w:t>/</w:t>
+      </w:r>
+      <w:r>
+        <w:rPr>
+          <w:rFonts w:eastAsia="Times New Roman" w:cs="Times New Roman"/>
+          <w:color w:val="1A1A1A"/>
+          <w:i/>
+          <w:iCs/>
         </w:rPr>
         <w:t>PDF</w:t>
       </w:r>
@@ -1490,14 +1560,14 @@
           <w:rFonts w:eastAsia="Times New Roman" w:cs="Times New Roman"/>
           <w:color w:val="1A1A1A"/>
         </w:rPr>
-        <w:t xml:space="preserve">, </w:t>
-      </w:r>
-      <w:r>
-        <w:rPr>
-          <w:rFonts w:eastAsia="Times New Roman" w:cs="Times New Roman"/>
-          <w:i/>
-          <w:iCs/>
-          <w:color w:val="1A1A1A"/>
+        <w:t>/</w:t>
+      </w:r>
+      <w:r>
+        <w:rPr>
+          <w:rFonts w:eastAsia="Times New Roman" w:cs="Times New Roman"/>
+          <w:color w:val="1A1A1A"/>
+          <w:i/>
+          <w:iCs/>
         </w:rPr>
         <w:t>WhatsApp</w:t>
       </w:r>
@@ -1506,14 +1576,238 @@
           <w:rFonts w:eastAsia="Times New Roman" w:cs="Times New Roman"/>
           <w:color w:val="1A1A1A"/>
         </w:rPr>
-        <w:t xml:space="preserve">, berkas fisik); rekapitulasi Standar Pelayanan Minimum (SPM) 5–10 hari kerja; laporan pengawas 2–4 minggu; dokumentasi foto tidak terarsip terpusat. Sesudah inovasi (per 29 Juni 2026): 558 paket pekerjaan terpantau; rekapitulasi Standar Pelayanan Minimum (SPM) kurang dari 1 hari kerja; 29 pengawas aktif di 33 lokasi dengan laporan mingguan terstruktur; 6.453 foto dokumentasi terarsip; 364 unit </w:t>
-      </w:r>
-      <w:r>
-        <w:rPr>
-          <w:rFonts w:eastAsia="Times New Roman" w:cs="Times New Roman"/>
-          <w:i/>
-          <w:iCs/>
-          <w:color w:val="1A1A1A"/>
+        <w:t xml:space="preserve"> ditambah silo sandb &amp; amspro. SESUDAH (terukur live per 13 Juli 2026): (1) ketersediaan rekap </w:t>
+      </w:r>
+      <w:r>
+        <w:rPr>
+          <w:rFonts w:eastAsia="Times New Roman" w:cs="Times New Roman"/>
+          <w:color w:val="1A1A1A"/>
+          <w:i/>
+          <w:iCs/>
+        </w:rPr>
+        <w:t>digital</w:t>
+      </w:r>
+      <w:r>
+        <w:rPr>
+          <w:rFonts w:eastAsia="Times New Roman" w:cs="Times New Roman"/>
+          <w:color w:val="1A1A1A"/>
+        </w:rPr>
+        <w:t xml:space="preserve"> Standar Pelayanan Minimum (SPM)+</w:t>
+      </w:r>
+      <w:r>
+        <w:rPr>
+          <w:rFonts w:eastAsia="Times New Roman" w:cs="Times New Roman"/>
+          <w:color w:val="1A1A1A"/>
+          <w:i/>
+          <w:iCs/>
+        </w:rPr>
+        <w:t>dashboard</w:t>
+      </w:r>
+      <w:r>
+        <w:rPr>
+          <w:rFonts w:eastAsia="Times New Roman" w:cs="Times New Roman"/>
+          <w:color w:val="1A1A1A"/>
+        </w:rPr>
+        <w:t xml:space="preserve"> = median 2,3 detik (same-day / &lt;0,1 HK) (n=5 trial rantai </w:t>
+      </w:r>
+      <w:r>
+        <w:rPr>
+          <w:rFonts w:eastAsia="Times New Roman" w:cs="Times New Roman"/>
+          <w:color w:val="1A1A1A"/>
+          <w:i/>
+          <w:iCs/>
+        </w:rPr>
+        <w:t>API</w:t>
+      </w:r>
+      <w:r>
+        <w:rPr>
+          <w:rFonts w:eastAsia="Times New Roman" w:cs="Times New Roman"/>
+          <w:color w:val="1A1A1A"/>
+        </w:rPr>
+        <w:t xml:space="preserve"> stats air minum + sanitasi + </w:t>
+      </w:r>
+      <w:r>
+        <w:rPr>
+          <w:rFonts w:eastAsia="Times New Roman" w:cs="Times New Roman"/>
+          <w:color w:val="1A1A1A"/>
+          <w:i/>
+          <w:iCs/>
+        </w:rPr>
+        <w:t>dashboard</w:t>
+      </w:r>
+      <w:r>
+        <w:rPr>
+          <w:rFonts w:eastAsia="Times New Roman" w:cs="Times New Roman"/>
+          <w:color w:val="1A1A1A"/>
+        </w:rPr>
+        <w:t xml:space="preserve">) → efisiensi waktu rekap ≈ 98,7% memakai rumus (sebelum−sesudah)/sebelum; (2) interval antar-hari </w:t>
+      </w:r>
+      <w:r>
+        <w:rPr>
+          <w:rFonts w:eastAsia="Times New Roman" w:cs="Times New Roman"/>
+          <w:color w:val="1A1A1A"/>
+          <w:i/>
+          <w:iCs/>
+        </w:rPr>
+        <w:t>update</w:t>
+      </w:r>
+      <w:r>
+        <w:rPr>
+          <w:rFonts w:eastAsia="Times New Roman" w:cs="Times New Roman"/>
+          <w:color w:val="1A1A1A"/>
+        </w:rPr>
+        <w:t xml:space="preserve"> progres dari </w:t>
+      </w:r>
+      <w:r>
+        <w:rPr>
+          <w:rFonts w:eastAsia="Times New Roman" w:cs="Times New Roman"/>
+          <w:color w:val="1A1A1A"/>
+          <w:i/>
+          <w:iCs/>
+        </w:rPr>
+        <w:t>audit log</w:t>
+      </w:r>
+      <w:r>
+        <w:rPr>
+          <w:rFonts w:eastAsia="Times New Roman" w:cs="Times New Roman"/>
+          <w:color w:val="1A1A1A"/>
+        </w:rPr>
+        <w:t xml:space="preserve"> </w:t>
+      </w:r>
+      <w:r>
+        <w:rPr>
+          <w:rFonts w:eastAsia="Times New Roman" w:cs="Times New Roman"/>
+          <w:color w:val="1A1A1A"/>
+          <w:i/>
+          <w:iCs/>
+        </w:rPr>
+        <w:t>Progress</w:t>
+      </w:r>
+      <w:r>
+        <w:rPr>
+          <w:rFonts w:eastAsia="Times New Roman" w:cs="Times New Roman"/>
+          <w:color w:val="1A1A1A"/>
+        </w:rPr>
+        <w:t xml:space="preserve"> = median 12 hari antar-</w:t>
+      </w:r>
+      <w:r>
+        <w:rPr>
+          <w:rFonts w:eastAsia="Times New Roman" w:cs="Times New Roman"/>
+          <w:color w:val="1A1A1A"/>
+          <w:i/>
+          <w:iCs/>
+        </w:rPr>
+        <w:t>update</w:t>
+      </w:r>
+      <w:r>
+        <w:rPr>
+          <w:rFonts w:eastAsia="Times New Roman" w:cs="Times New Roman"/>
+          <w:color w:val="1A1A1A"/>
+        </w:rPr>
+        <w:t xml:space="preserve"> (audit </w:t>
+      </w:r>
+      <w:r>
+        <w:rPr>
+          <w:rFonts w:eastAsia="Times New Roman" w:cs="Times New Roman"/>
+          <w:color w:val="1A1A1A"/>
+          <w:i/>
+          <w:iCs/>
+        </w:rPr>
+        <w:t>Progress</w:t>
+      </w:r>
+      <w:r>
+        <w:rPr>
+          <w:rFonts w:eastAsia="Times New Roman" w:cs="Times New Roman"/>
+          <w:color w:val="1A1A1A"/>
+        </w:rPr>
+        <w:t xml:space="preserve">) (n=9 interval pada 7 paket multi-hari) → efisiensi interval ≈ 42,9% vs titik tengah manual; (3) </w:t>
+      </w:r>
+      <w:r>
+        <w:rPr>
+          <w:rFonts w:eastAsia="Times New Roman" w:cs="Times New Roman"/>
+          <w:color w:val="1A1A1A"/>
+          <w:i/>
+          <w:iCs/>
+        </w:rPr>
+        <w:t>snapshot</w:t>
+      </w:r>
+      <w:r>
+        <w:rPr>
+          <w:rFonts w:eastAsia="Times New Roman" w:cs="Times New Roman"/>
+          <w:color w:val="1A1A1A"/>
+        </w:rPr>
+        <w:t xml:space="preserve"> </w:t>
+      </w:r>
+      <w:r>
+        <w:rPr>
+          <w:rFonts w:eastAsia="Times New Roman" w:cs="Times New Roman"/>
+          <w:color w:val="1A1A1A"/>
+          <w:i/>
+          <w:iCs/>
+        </w:rPr>
+        <w:t>progress</w:t>
+      </w:r>
+      <w:r>
+        <w:rPr>
+          <w:rFonts w:eastAsia="Times New Roman" w:cs="Times New Roman"/>
+          <w:color w:val="1A1A1A"/>
+        </w:rPr>
+        <w:t xml:space="preserve"> fisik: 36,8% dari 87 paket di-</w:t>
+      </w:r>
+      <w:r>
+        <w:rPr>
+          <w:rFonts w:eastAsia="Times New Roman" w:cs="Times New Roman"/>
+          <w:color w:val="1A1A1A"/>
+          <w:i/>
+          <w:iCs/>
+        </w:rPr>
+        <w:t>update</w:t>
+      </w:r>
+      <w:r>
+        <w:rPr>
+          <w:rFonts w:eastAsia="Times New Roman" w:cs="Times New Roman"/>
+          <w:color w:val="1A1A1A"/>
+        </w:rPr>
+        <w:t xml:space="preserve"> ≤14 hari dan 83,9% ≤30 hari; (4) kelengkapan: 16/16 pengawas </w:t>
+      </w:r>
+      <w:r>
+        <w:rPr>
+          <w:rFonts w:eastAsia="Times New Roman" w:cs="Times New Roman"/>
+          <w:color w:val="1A1A1A"/>
+          <w:i/>
+          <w:iCs/>
+        </w:rPr>
+        <w:t>KPI</w:t>
+      </w:r>
+      <w:r>
+        <w:rPr>
+          <w:rFonts w:eastAsia="Times New Roman" w:cs="Times New Roman"/>
+          <w:color w:val="1A1A1A"/>
+        </w:rPr>
+        <w:t xml:space="preserve"> punya foto, 4.314 event foto di </w:t>
+      </w:r>
+      <w:r>
+        <w:rPr>
+          <w:rFonts w:eastAsia="Times New Roman" w:cs="Times New Roman"/>
+          <w:color w:val="1A1A1A"/>
+          <w:i/>
+          <w:iCs/>
+        </w:rPr>
+        <w:t>audit log</w:t>
+      </w:r>
+      <w:r>
+        <w:rPr>
+          <w:rFonts w:eastAsia="Times New Roman" w:cs="Times New Roman"/>
+          <w:color w:val="1A1A1A"/>
+        </w:rPr>
+        <w:t xml:space="preserve">, 558 pekerjaan dan 364 unit </w:t>
+      </w:r>
+      <w:r>
+        <w:rPr>
+          <w:rFonts w:eastAsia="Times New Roman" w:cs="Times New Roman"/>
+          <w:color w:val="1A1A1A"/>
+          <w:i/>
+          <w:iCs/>
         </w:rPr>
         <w:t>SPAM</w:t>
       </w:r>
@@ -1522,23 +1816,39 @@
           <w:rFonts w:eastAsia="Times New Roman" w:cs="Times New Roman"/>
           <w:color w:val="1A1A1A"/>
         </w:rPr>
-        <w:t xml:space="preserve"> terdata </w:t>
-      </w:r>
-      <w:r>
-        <w:rPr>
-          <w:rFonts w:eastAsia="Times New Roman" w:cs="Times New Roman"/>
-          <w:i/>
-          <w:iCs/>
-          <w:color w:val="1A1A1A"/>
-        </w:rPr>
-        <w:t>digital</w:t>
-      </w:r>
-      <w:r>
-        <w:rPr>
-          <w:rFonts w:eastAsia="Times New Roman" w:cs="Times New Roman"/>
-          <w:color w:val="1A1A1A"/>
-        </w:rPr>
-        <w:t>; peta capaian 365 desa dapat diakses masyarakat tanpa pendaftaran.</w:t>
+        <w:t xml:space="preserve"> terdata, peta capaian 365 desa terbuka. Keberlanjutan 2026–2028: penajaman integrasi SPM–pekerjaan &amp; </w:t>
+      </w:r>
+      <w:r>
+        <w:rPr>
+          <w:rFonts w:eastAsia="Times New Roman" w:cs="Times New Roman"/>
+          <w:color w:val="1A1A1A"/>
+          <w:i/>
+          <w:iCs/>
+        </w:rPr>
+        <w:t>KPI</w:t>
+      </w:r>
+      <w:r>
+        <w:rPr>
+          <w:rFonts w:eastAsia="Times New Roman" w:cs="Times New Roman"/>
+          <w:color w:val="1A1A1A"/>
+        </w:rPr>
+        <w:t xml:space="preserve"> (2026), kualitas data historis &amp; pelatihan (2027), pemeliharaan </w:t>
+      </w:r>
+      <w:r>
+        <w:rPr>
+          <w:rFonts w:eastAsia="Times New Roman" w:cs="Times New Roman"/>
+          <w:color w:val="1A1A1A"/>
+          <w:i/>
+          <w:iCs/>
+        </w:rPr>
+        <w:t>platform</w:t>
+      </w:r>
+      <w:r>
+        <w:rPr>
+          <w:rFonts w:eastAsia="Times New Roman" w:cs="Times New Roman"/>
+          <w:color w:val="1A1A1A"/>
+        </w:rPr>
+        <w:t xml:space="preserve"> &amp; backup (2028).</w:t>
       </w:r>
     </w:p>
     <w:p>
@@ -1551,21 +1861,22 @@
     </w:p>
     <w:p>
       <w:pPr>
-        <w:spacing w:before="40" w:line="360" w:lineRule="auto"/>
-      </w:pPr>
-      <w:r>
-        <w:rPr>
-          <w:rFonts w:eastAsia="Times New Roman" w:cs="Times New Roman"/>
-          <w:color w:val="1A1A1A"/>
-        </w:rPr>
-        <w:t xml:space="preserve">Keunggulan utama Arumanis dibanding sistem sejenis terletak pada pemantauan pekerjaan konstruksi </w:t>
-      </w:r>
-      <w:r>
-        <w:rPr>
-          <w:rFonts w:eastAsia="Times New Roman" w:cs="Times New Roman"/>
-          <w:i/>
-          <w:iCs/>
-          <w:color w:val="1A1A1A"/>
+        <w:spacing w:before="40" w:after="160" w:line="360" w:lineRule="auto"/>
+        <w:jc w:val="both"/>
+      </w:pPr>
+      <w:r>
+        <w:rPr>
+          <w:rFonts w:eastAsia="Times New Roman" w:cs="Times New Roman"/>
+          <w:color w:val="1A1A1A"/>
+        </w:rPr>
+        <w:t xml:space="preserve">Diferensiasi Arumanis terhadap sistem sejenis (misalnya pencatatan aset </w:t>
+      </w:r>
+      <w:r>
+        <w:rPr>
+          <w:rFonts w:eastAsia="Times New Roman" w:cs="Times New Roman"/>
+          <w:color w:val="1A1A1A"/>
+          <w:i/>
+          <w:iCs/>
         </w:rPr>
         <w:t>SPAM</w:t>
       </w:r>
@@ -1574,38 +1885,14 @@
           <w:rFonts w:eastAsia="Times New Roman" w:cs="Times New Roman"/>
           <w:color w:val="1A1A1A"/>
         </w:rPr>
-        <w:t xml:space="preserve"> perdesaan dan sanitasi (khususnya pengelolaan air limbah) dalam satu aplikasi terintegrasi, bukan hanya pencatatan aset statis. Kebaharuan meliputi penyajian capaian SPM terbuka per desa, penandaan tingkat kelengkapan data, </w:t>
-      </w:r>
-      <w:r>
-        <w:rPr>
-          <w:rFonts w:eastAsia="Times New Roman" w:cs="Times New Roman"/>
-          <w:color w:val="1A1A1A"/>
-        </w:rPr>
-        <w:lastRenderedPageBreak/>
-        <w:t xml:space="preserve">keterkaitan data unit </w:t>
-      </w:r>
-      <w:r>
-        <w:rPr>
-          <w:rFonts w:eastAsia="Times New Roman" w:cs="Times New Roman"/>
-          <w:i/>
-          <w:iCs/>
-          <w:color w:val="1A1A1A"/>
-        </w:rPr>
-        <w:t>SPAM</w:t>
-      </w:r>
-      <w:r>
-        <w:rPr>
-          <w:rFonts w:eastAsia="Times New Roman" w:cs="Times New Roman"/>
-          <w:color w:val="1A1A1A"/>
-        </w:rPr>
-        <w:t xml:space="preserve"> nasional </w:t>
-      </w:r>
-      <w:r>
-        <w:rPr>
-          <w:rFonts w:eastAsia="Times New Roman" w:cs="Times New Roman"/>
-          <w:i/>
-          <w:iCs/>
-          <w:color w:val="1A1A1A"/>
+        <w:t xml:space="preserve"> nasional/</w:t>
+      </w:r>
+      <w:r>
+        <w:rPr>
+          <w:rFonts w:eastAsia="Times New Roman" w:cs="Times New Roman"/>
+          <w:color w:val="1A1A1A"/>
+          <w:i/>
+          <w:iCs/>
         </w:rPr>
         <w:t>SIMSPAM</w:t>
       </w:r>
@@ -1614,7 +1901,135 @@
           <w:rFonts w:eastAsia="Times New Roman" w:cs="Times New Roman"/>
           <w:color w:val="1A1A1A"/>
         </w:rPr>
-        <w:t xml:space="preserve"> (33 unit), dokumentasi foto berlokasi, hak akses berbeda per peran pengguna, serta penggabungan data historis multi-sumber sejak 2017.</w:t>
+        <w:t xml:space="preserve"> atau spreadsheet dinas): Arumanis mengikat siklus utuh pekerjaan konstruksi air minum perdesaan dan sanitasi air limbah—bukan hanya inventaris statis—dari kegiatan, kontrak, progres fisik/keuangan, foto ber-</w:t>
+      </w:r>
+      <w:r>
+        <w:rPr>
+          <w:rFonts w:eastAsia="Times New Roman" w:cs="Times New Roman"/>
+          <w:color w:val="1A1A1A"/>
+          <w:i/>
+          <w:iCs/>
+        </w:rPr>
+        <w:t>GPS</w:t>
+      </w:r>
+      <w:r>
+        <w:rPr>
+          <w:rFonts w:eastAsia="Times New Roman" w:cs="Times New Roman"/>
+          <w:color w:val="1A1A1A"/>
+        </w:rPr>
+        <w:t xml:space="preserve">, </w:t>
+      </w:r>
+      <w:r>
+        <w:rPr>
+          <w:rFonts w:eastAsia="Times New Roman" w:cs="Times New Roman"/>
+          <w:color w:val="1A1A1A"/>
+          <w:i/>
+          <w:iCs/>
+        </w:rPr>
+        <w:t>KPI</w:t>
+      </w:r>
+      <w:r>
+        <w:rPr>
+          <w:rFonts w:eastAsia="Times New Roman" w:cs="Times New Roman"/>
+          <w:color w:val="1A1A1A"/>
+        </w:rPr>
+        <w:t xml:space="preserve"> pengawas, hingga capaian Standar Pelayanan Minimum (SPM) per desa yang dipublikasikan. Kebaharuan: (1) satu </w:t>
+      </w:r>
+      <w:r>
+        <w:rPr>
+          <w:rFonts w:eastAsia="Times New Roman" w:cs="Times New Roman"/>
+          <w:color w:val="1A1A1A"/>
+          <w:i/>
+          <w:iCs/>
+        </w:rPr>
+        <w:t>platform</w:t>
+      </w:r>
+      <w:r>
+        <w:rPr>
+          <w:rFonts w:eastAsia="Times New Roman" w:cs="Times New Roman"/>
+          <w:color w:val="1A1A1A"/>
+        </w:rPr>
+        <w:t xml:space="preserve"> kantor + lapangan + publik; (2) penandaan kelengkapan data dan status integrasi infrastruktur–pekerjaan; (3) tautan ke data </w:t>
+      </w:r>
+      <w:r>
+        <w:rPr>
+          <w:rFonts w:eastAsia="Times New Roman" w:cs="Times New Roman"/>
+          <w:color w:val="1A1A1A"/>
+          <w:i/>
+          <w:iCs/>
+        </w:rPr>
+        <w:t>SIMSPAM</w:t>
+      </w:r>
+      <w:r>
+        <w:rPr>
+          <w:rFonts w:eastAsia="Times New Roman" w:cs="Times New Roman"/>
+          <w:color w:val="1A1A1A"/>
+        </w:rPr>
+        <w:t xml:space="preserve"> nasional (33 unit) tanpa menggantikan sistem pusat; (4) </w:t>
+      </w:r>
+      <w:r>
+        <w:rPr>
+          <w:rFonts w:eastAsia="Times New Roman" w:cs="Times New Roman"/>
+          <w:color w:val="1A1A1A"/>
+          <w:i/>
+          <w:iCs/>
+        </w:rPr>
+        <w:t>role-based access</w:t>
+      </w:r>
+      <w:r>
+        <w:rPr>
+          <w:rFonts w:eastAsia="Times New Roman" w:cs="Times New Roman"/>
+          <w:color w:val="1A1A1A"/>
+        </w:rPr>
+        <w:t xml:space="preserve"> dan </w:t>
+      </w:r>
+      <w:r>
+        <w:rPr>
+          <w:rFonts w:eastAsia="Times New Roman" w:cs="Times New Roman"/>
+          <w:color w:val="1A1A1A"/>
+          <w:i/>
+          <w:iCs/>
+        </w:rPr>
+        <w:t>audit log</w:t>
+      </w:r>
+      <w:r>
+        <w:rPr>
+          <w:rFonts w:eastAsia="Times New Roman" w:cs="Times New Roman"/>
+          <w:color w:val="1A1A1A"/>
+        </w:rPr>
+        <w:t xml:space="preserve">; (5) penggabungan data multi-sumber sejak 2017 menjadi </w:t>
+      </w:r>
+      <w:r>
+        <w:rPr>
+          <w:rFonts w:eastAsia="Times New Roman" w:cs="Times New Roman"/>
+          <w:color w:val="1A1A1A"/>
+          <w:i/>
+          <w:iCs/>
+        </w:rPr>
+        <w:t>baseline</w:t>
+      </w:r>
+      <w:r>
+        <w:rPr>
+          <w:rFonts w:eastAsia="Times New Roman" w:cs="Times New Roman"/>
+          <w:color w:val="1A1A1A"/>
+        </w:rPr>
+        <w:t xml:space="preserve"> perencanaan. Keunggulan praktis: pimpinan melihat </w:t>
+      </w:r>
+      <w:r>
+        <w:rPr>
+          <w:rFonts w:eastAsia="Times New Roman" w:cs="Times New Roman"/>
+          <w:color w:val="1A1A1A"/>
+          <w:i/>
+          <w:iCs/>
+        </w:rPr>
+        <w:t>deviasi</w:t>
+      </w:r>
+      <w:r>
+        <w:rPr>
+          <w:rFonts w:eastAsia="Times New Roman" w:cs="Times New Roman"/>
+          <w:color w:val="1A1A1A"/>
+        </w:rPr>
+        <w:t xml:space="preserve"> lebih awal; pengawas punya alur wajib terstruktur; masyarakat memverifikasi capaian desa tanpa birokrasi tatap muka.</w:t>
       </w:r>
     </w:p>
     <w:p>
@@ -1627,21 +2042,22 @@
     </w:p>
     <w:p>
       <w:pPr>
-        <w:spacing w:before="40" w:line="360" w:lineRule="auto"/>
-      </w:pPr>
-      <w:r>
-        <w:rPr>
-          <w:rFonts w:eastAsia="Times New Roman" w:cs="Times New Roman"/>
-          <w:color w:val="1A1A1A"/>
-        </w:rPr>
-        <w:t xml:space="preserve">(1) Operator/koordinator dinas membuka aplikasi Arumanis untuk mengelola kegiatan, kontrak, dan data </w:t>
-      </w:r>
-      <w:r>
-        <w:rPr>
-          <w:rFonts w:eastAsia="Times New Roman" w:cs="Times New Roman"/>
-          <w:i/>
-          <w:iCs/>
-          <w:color w:val="1A1A1A"/>
+        <w:spacing w:before="40" w:after="160" w:line="360" w:lineRule="auto"/>
+        <w:jc w:val="both"/>
+      </w:pPr>
+      <w:r>
+        <w:rPr>
+          <w:rFonts w:eastAsia="Times New Roman" w:cs="Times New Roman"/>
+          <w:color w:val="1A1A1A"/>
+        </w:rPr>
+        <w:t xml:space="preserve">(1) Institusionalisasi: penugasan operator Bidang Air Minum dan Sanitasi, SOP penggunaan, dan hak akses per peran. (2) Operator/koordinator mengelola kegiatan, kontrak, data unit </w:t>
+      </w:r>
+      <w:r>
+        <w:rPr>
+          <w:rFonts w:eastAsia="Times New Roman" w:cs="Times New Roman"/>
+          <w:color w:val="1A1A1A"/>
+          <w:i/>
+          <w:iCs/>
         </w:rPr>
         <w:t>SPAM</w:t>
       </w:r>
@@ -1650,7 +2066,39 @@
           <w:rFonts w:eastAsia="Times New Roman" w:cs="Times New Roman"/>
           <w:color w:val="1A1A1A"/>
         </w:rPr>
-        <w:t>/sanitasi. (2) Pengawas lapangan mengisi progres mingguan, mengunggah foto lokasi, dan laporan anggaran fisik melalui fitur pengawasan terpadu. (3) Masyarakat membuka halaman peta capaian SPM per desa tanpa pendaftaran. (4) Data langsung tersimpan dan tampilan ringkasan diperbarui untuk evaluasi program.</w:t>
+        <w:t xml:space="preserve">, dan infrastruktur sanitasi. (3) Pengawas lapangan mengisi progres mingguan, mengunggah foto lokasi, dan melaporkan realisasi fisik–anggaran. (4) Pimpinan/PUSPEN meninjau rekap progres, </w:t>
+      </w:r>
+      <w:r>
+        <w:rPr>
+          <w:rFonts w:eastAsia="Times New Roman" w:cs="Times New Roman"/>
+          <w:color w:val="1A1A1A"/>
+          <w:i/>
+          <w:iCs/>
+        </w:rPr>
+        <w:t>KPI</w:t>
+      </w:r>
+      <w:r>
+        <w:rPr>
+          <w:rFonts w:eastAsia="Times New Roman" w:cs="Times New Roman"/>
+          <w:color w:val="1A1A1A"/>
+        </w:rPr>
+        <w:t xml:space="preserve">, dan catatan kritis (misalnya progres tinggi tanpa </w:t>
+      </w:r>
+      <w:r>
+        <w:rPr>
+          <w:rFonts w:eastAsia="Times New Roman" w:cs="Times New Roman"/>
+          <w:color w:val="1A1A1A"/>
+          <w:i/>
+          <w:iCs/>
+        </w:rPr>
+        <w:t>output</w:t>
+      </w:r>
+      <w:r>
+        <w:rPr>
+          <w:rFonts w:eastAsia="Times New Roman" w:cs="Times New Roman"/>
+          <w:color w:val="1A1A1A"/>
+        </w:rPr>
+        <w:t>). (5) Masyarakat mengakses peta capaian Standar Pelayanan Minimum (SPM) per desa tanpa pendaftaran. (6) Data tersimpan terpusat; ringkasan diperbarui untuk evaluasi program dan pelaporan periodik.</w:t>
       </w:r>
     </w:p>
     <w:p>
@@ -1676,22 +2124,23 @@
     </w:p>
     <w:p>
       <w:pPr>
-        <w:spacing w:before="40" w:line="360" w:lineRule="auto"/>
+        <w:spacing w:before="40" w:after="160" w:line="360" w:lineRule="auto"/>
         <w:ind w:left="360"/>
-      </w:pPr>
-      <w:r>
-        <w:rPr>
-          <w:rFonts w:eastAsia="Times New Roman" w:cs="Times New Roman"/>
-          <w:color w:val="1A1A1A"/>
-        </w:rPr>
-        <w:t xml:space="preserve">Tujuan inovasi diarahkan pada terwujudnya pemantauan pekerjaan konstruksi </w:t>
-      </w:r>
-      <w:r>
-        <w:rPr>
-          <w:rFonts w:eastAsia="Times New Roman" w:cs="Times New Roman"/>
-          <w:i/>
-          <w:iCs/>
-          <w:color w:val="1A1A1A"/>
+        <w:jc w:val="both"/>
+      </w:pPr>
+      <w:r>
+        <w:rPr>
+          <w:rFonts w:eastAsia="Times New Roman" w:cs="Times New Roman"/>
+          <w:color w:val="1A1A1A"/>
+        </w:rPr>
+        <w:t xml:space="preserve">Tujuan: mewujudkan tata kelola pemantauan konstruksi </w:t>
+      </w:r>
+      <w:r>
+        <w:rPr>
+          <w:rFonts w:eastAsia="Times New Roman" w:cs="Times New Roman"/>
+          <w:color w:val="1A1A1A"/>
+          <w:i/>
+          <w:iCs/>
         </w:rPr>
         <w:t>SPAM</w:t>
       </w:r>
@@ -1700,7 +2149,151 @@
           <w:rFonts w:eastAsia="Times New Roman" w:cs="Times New Roman"/>
           <w:color w:val="1A1A1A"/>
         </w:rPr>
-        <w:t xml:space="preserve"> perdesaan dan sanitasi yang terukur, disertai kemampuan menyajikan data terkini. Target hingga akhir 2026: (1) seluruh paket aktif terpantau (558 pekerjaan tercatat); (2) progres fisik dilaporkan minimal mingguan; (3) dokumentasi foto ≥90% paket aktif; (4) penyelarasan data historis 2017–sekarang dengan selisih antarsumber di bawah 5%; (5) ringkasan capaian 365 desa diperbarui langsung; (6) publikasi capaian SPM dapat diakses masyarakat tanpa pendaftaran.</w:t>
+        <w:t xml:space="preserve"> perdesaan dan sanitasi yang terukur, tepat waktu, dan transparan, sehingga keputusan alokasi dan koreksi </w:t>
+      </w:r>
+      <w:r>
+        <w:rPr>
+          <w:rFonts w:eastAsia="Times New Roman" w:cs="Times New Roman"/>
+          <w:color w:val="1A1A1A"/>
+          <w:i/>
+          <w:iCs/>
+        </w:rPr>
+        <w:t>deviasi</w:t>
+      </w:r>
+      <w:r>
+        <w:rPr>
+          <w:rFonts w:eastAsia="Times New Roman" w:cs="Times New Roman"/>
+          <w:color w:val="1A1A1A"/>
+        </w:rPr>
+        <w:t xml:space="preserve"> berbasis data terkini. Target terukur hingga akhir 2026: (1) 100% paket aktif terpantau dalam sistem (</w:t>
+      </w:r>
+      <w:r>
+        <w:rPr>
+          <w:rFonts w:eastAsia="Times New Roman" w:cs="Times New Roman"/>
+          <w:color w:val="1A1A1A"/>
+          <w:i/>
+          <w:iCs/>
+        </w:rPr>
+        <w:t>baseline</w:t>
+      </w:r>
+      <w:r>
+        <w:rPr>
+          <w:rFonts w:eastAsia="Times New Roman" w:cs="Times New Roman"/>
+          <w:color w:val="1A1A1A"/>
+        </w:rPr>
+        <w:t xml:space="preserve"> tercatat 558 pekerjaan); (2) frekuensi </w:t>
+      </w:r>
+      <w:r>
+        <w:rPr>
+          <w:rFonts w:eastAsia="Times New Roman" w:cs="Times New Roman"/>
+          <w:color w:val="1A1A1A"/>
+          <w:i/>
+          <w:iCs/>
+        </w:rPr>
+        <w:t>update</w:t>
+      </w:r>
+      <w:r>
+        <w:rPr>
+          <w:rFonts w:eastAsia="Times New Roman" w:cs="Times New Roman"/>
+          <w:color w:val="1A1A1A"/>
+        </w:rPr>
+        <w:t xml:space="preserve"> progres mendekati mingguan (</w:t>
+      </w:r>
+      <w:r>
+        <w:rPr>
+          <w:rFonts w:eastAsia="Times New Roman" w:cs="Times New Roman"/>
+          <w:color w:val="1A1A1A"/>
+          <w:i/>
+          <w:iCs/>
+        </w:rPr>
+        <w:t>baseline</w:t>
+      </w:r>
+      <w:r>
+        <w:rPr>
+          <w:rFonts w:eastAsia="Times New Roman" w:cs="Times New Roman"/>
+          <w:color w:val="1A1A1A"/>
+        </w:rPr>
+        <w:t xml:space="preserve"> terukur median 12 hari antar-</w:t>
+      </w:r>
+      <w:r>
+        <w:rPr>
+          <w:rFonts w:eastAsia="Times New Roman" w:cs="Times New Roman"/>
+          <w:color w:val="1A1A1A"/>
+          <w:i/>
+          <w:iCs/>
+        </w:rPr>
+        <w:t>update</w:t>
+      </w:r>
+      <w:r>
+        <w:rPr>
+          <w:rFonts w:eastAsia="Times New Roman" w:cs="Times New Roman"/>
+          <w:color w:val="1A1A1A"/>
+        </w:rPr>
+        <w:t xml:space="preserve">; target perbaikan ≤7 hari); (3) dokumentasi foto ≥90% paket aktif; (4) selisih penyelarasan data historis 2017–sekarang antarsumber &lt;5%; (5) ringkasan capaian 365 desa diperbarui </w:t>
+      </w:r>
+      <w:r>
+        <w:rPr>
+          <w:rFonts w:eastAsia="Times New Roman" w:cs="Times New Roman"/>
+          <w:color w:val="1A1A1A"/>
+          <w:i/>
+          <w:iCs/>
+        </w:rPr>
+        <w:t>real-time</w:t>
+      </w:r>
+      <w:r>
+        <w:rPr>
+          <w:rFonts w:eastAsia="Times New Roman" w:cs="Times New Roman"/>
+          <w:color w:val="1A1A1A"/>
+        </w:rPr>
+        <w:t xml:space="preserve"> di </w:t>
+      </w:r>
+      <w:r>
+        <w:rPr>
+          <w:rFonts w:eastAsia="Times New Roman" w:cs="Times New Roman"/>
+          <w:color w:val="1A1A1A"/>
+          <w:i/>
+          <w:iCs/>
+        </w:rPr>
+        <w:t>dashboard</w:t>
+      </w:r>
+      <w:r>
+        <w:rPr>
+          <w:rFonts w:eastAsia="Times New Roman" w:cs="Times New Roman"/>
+          <w:color w:val="1A1A1A"/>
+        </w:rPr>
+        <w:t xml:space="preserve">; (6) publikasi Standar Pelayanan Minimum (SPM) tetap terbuka tanpa pendaftaran. </w:t>
+      </w:r>
+      <w:r>
+        <w:rPr>
+          <w:rFonts w:eastAsia="Times New Roman" w:cs="Times New Roman"/>
+          <w:color w:val="1A1A1A"/>
+          <w:i/>
+          <w:iCs/>
+        </w:rPr>
+        <w:t>Outcome</w:t>
+      </w:r>
+      <w:r>
+        <w:rPr>
+          <w:rFonts w:eastAsia="Times New Roman" w:cs="Times New Roman"/>
+          <w:color w:val="1A1A1A"/>
+        </w:rPr>
+        <w:t xml:space="preserve"> yang dikejar: deteksi dini </w:t>
+      </w:r>
+      <w:r>
+        <w:rPr>
+          <w:rFonts w:eastAsia="Times New Roman" w:cs="Times New Roman"/>
+          <w:color w:val="1A1A1A"/>
+          <w:i/>
+          <w:iCs/>
+        </w:rPr>
+        <w:t>deviasi</w:t>
+      </w:r>
+      <w:r>
+        <w:rPr>
+          <w:rFonts w:eastAsia="Times New Roman" w:cs="Times New Roman"/>
+          <w:color w:val="1A1A1A"/>
+        </w:rPr>
+        <w:t>, pengurangan waktu rekap, dan akuntabilitas publik atas cakupan layanan.</w:t>
       </w:r>
     </w:p>
     <w:p>
@@ -1713,22 +2306,23 @@
     </w:p>
     <w:p>
       <w:pPr>
-        <w:spacing w:before="40" w:line="360" w:lineRule="auto"/>
+        <w:spacing w:before="40" w:after="160" w:line="360" w:lineRule="auto"/>
         <w:ind w:left="360"/>
-      </w:pPr>
-      <w:r>
-        <w:rPr>
-          <w:rFonts w:eastAsia="Times New Roman" w:cs="Times New Roman"/>
-          <w:color w:val="1A1A1A"/>
-        </w:rPr>
-        <w:t xml:space="preserve">Bagi penyelenggara program: </w:t>
-      </w:r>
-      <w:r>
-        <w:rPr>
-          <w:rFonts w:eastAsia="Times New Roman" w:cs="Times New Roman"/>
-          <w:i/>
-          <w:iCs/>
-          <w:color w:val="1A1A1A"/>
+        <w:jc w:val="both"/>
+      </w:pPr>
+      <w:r>
+        <w:rPr>
+          <w:rFonts w:eastAsia="Times New Roman" w:cs="Times New Roman"/>
+          <w:color w:val="1A1A1A"/>
+        </w:rPr>
+        <w:t xml:space="preserve">Penyelenggara program: </w:t>
+      </w:r>
+      <w:r>
+        <w:rPr>
+          <w:rFonts w:eastAsia="Times New Roman" w:cs="Times New Roman"/>
+          <w:color w:val="1A1A1A"/>
+          <w:i/>
+          <w:iCs/>
         </w:rPr>
         <w:t>deviasi</w:t>
       </w:r>
@@ -1737,7 +2331,39 @@
           <w:rFonts w:eastAsia="Times New Roman" w:cs="Times New Roman"/>
           <w:color w:val="1A1A1A"/>
         </w:rPr>
-        <w:t xml:space="preserve"> fisik dan keuangan teridentifikasi lebih awal; evaluasi Standar Pelayanan Minimum (SPM) air minum (13,25%) dan sanitasi (1,90%); anggaran terpetakan air minum Rp 91,47 miliar, sanitasi Rp 63,30 miliar, pekerjaan Rp 95,28 miliar (466 kontrak). Bagi pengawas: alur kerja terstruktur dalam satu aplikasi. Bagi masyarakat: capaian per desa dapat dicek kapan saja tanpa ke kantor dinas. Manfaat menjangkau 2.535.002 jiwa penduduk di 33 kecamatan.</w:t>
+        <w:t xml:space="preserve"> fisik–keuangan teridentifikasi lebih awal; evaluasi Standar Pelayanan Minimum (SPM) air minum (13,26%) dan sanitasi (1,92%) berbasis data terpusat; anggaran terpetakan—air minum Rp 92,27 miliar, sanitasi Rp 63,99 miliar, pekerjaan Rp 95,28 miliar (467 kontrak). Pengawas: alur kerja tunggal (progres, foto, tiket) mengurangi ketergantungan </w:t>
+      </w:r>
+      <w:r>
+        <w:rPr>
+          <w:rFonts w:eastAsia="Times New Roman" w:cs="Times New Roman"/>
+          <w:color w:val="1A1A1A"/>
+          <w:i/>
+          <w:iCs/>
+        </w:rPr>
+        <w:t>WhatsApp</w:t>
+      </w:r>
+      <w:r>
+        <w:rPr>
+          <w:rFonts w:eastAsia="Times New Roman" w:cs="Times New Roman"/>
+          <w:color w:val="1A1A1A"/>
+        </w:rPr>
+        <w:t xml:space="preserve">/berkas lepas. Masyarakat: cek capaian per desa kapan saja tanpa ke kantor dinas—manfaat keterbukaan menjangkau 2.535.002 jiwa di 33 kecamatan. Institusi: jejak </w:t>
+      </w:r>
+      <w:r>
+        <w:rPr>
+          <w:rFonts w:eastAsia="Times New Roman" w:cs="Times New Roman"/>
+          <w:color w:val="1A1A1A"/>
+          <w:i/>
+          <w:iCs/>
+        </w:rPr>
+        <w:t>digital</w:t>
+      </w:r>
+      <w:r>
+        <w:rPr>
+          <w:rFonts w:eastAsia="Times New Roman" w:cs="Times New Roman"/>
+          <w:color w:val="1A1A1A"/>
+        </w:rPr>
+        <w:t xml:space="preserve"> memperkuat akuntabilitas dan keberlanjutan pelaporan multi-tahun.</w:t>
       </w:r>
     </w:p>
     <w:p>
@@ -1750,38 +2376,39 @@
     </w:p>
     <w:p>
       <w:pPr>
-        <w:spacing w:before="40" w:line="360" w:lineRule="auto"/>
+        <w:spacing w:before="40" w:after="160" w:line="360" w:lineRule="auto"/>
         <w:ind w:left="360"/>
-      </w:pPr>
-      <w:r>
-        <w:rPr>
-          <w:rFonts w:eastAsia="Times New Roman" w:cs="Times New Roman"/>
-          <w:color w:val="1A1A1A"/>
-        </w:rPr>
-        <w:t xml:space="preserve">Hasil penyelenggaraan inovasi Arumanis per 29 Juni 2026 berupa aplikasi </w:t>
-      </w:r>
-      <w:r>
-        <w:rPr>
-          <w:rFonts w:eastAsia="Times New Roman" w:cs="Times New Roman"/>
-          <w:i/>
-          <w:iCs/>
-          <w:color w:val="1A1A1A"/>
-        </w:rPr>
-        <w:t>digital</w:t>
-      </w:r>
-      <w:r>
-        <w:rPr>
-          <w:rFonts w:eastAsia="Times New Roman" w:cs="Times New Roman"/>
-          <w:color w:val="1A1A1A"/>
-        </w:rPr>
-        <w:t xml:space="preserve"> yang mendukung pemantauan konstruksi dan penyajian data program secara langsung. </w:t>
-      </w:r>
-      <w:r>
-        <w:rPr>
-          <w:rFonts w:eastAsia="Times New Roman" w:cs="Times New Roman"/>
-          <w:i/>
-          <w:iCs/>
-          <w:color w:val="1A1A1A"/>
+        <w:jc w:val="both"/>
+      </w:pPr>
+      <w:r>
+        <w:rPr>
+          <w:rFonts w:eastAsia="Times New Roman" w:cs="Times New Roman"/>
+          <w:color w:val="1A1A1A"/>
+        </w:rPr>
+        <w:t xml:space="preserve">Per 08 Juli 2026, Arumanis telah diterapkan sebagai </w:t>
+      </w:r>
+      <w:r>
+        <w:rPr>
+          <w:rFonts w:eastAsia="Times New Roman" w:cs="Times New Roman"/>
+          <w:color w:val="1A1A1A"/>
+          <w:i/>
+          <w:iCs/>
+        </w:rPr>
+        <w:t>platform</w:t>
+      </w:r>
+      <w:r>
+        <w:rPr>
+          <w:rFonts w:eastAsia="Times New Roman" w:cs="Times New Roman"/>
+          <w:color w:val="1A1A1A"/>
+        </w:rPr>
+        <w:t xml:space="preserve"> operasional Bidang Air Minum dan Sanitasi. </w:t>
+      </w:r>
+      <w:r>
+        <w:rPr>
+          <w:rFonts w:eastAsia="Times New Roman" w:cs="Times New Roman"/>
+          <w:color w:val="1A1A1A"/>
+          <w:i/>
+          <w:iCs/>
         </w:rPr>
         <w:t>Output</w:t>
       </w:r>
@@ -1790,22 +2417,14 @@
           <w:rFonts w:eastAsia="Times New Roman" w:cs="Times New Roman"/>
           <w:color w:val="1A1A1A"/>
         </w:rPr>
-        <w:t xml:space="preserve"> inovasi meliputi: (1) aplikasi Arumanis dengan tampilan ringkasan pekerjaan, </w:t>
-      </w:r>
-      <w:r>
-        <w:rPr>
-          <w:rFonts w:eastAsia="Times New Roman" w:cs="Times New Roman"/>
-          <w:color w:val="1A1A1A"/>
-        </w:rPr>
-        <w:lastRenderedPageBreak/>
-        <w:t xml:space="preserve">pencatatan kegiatan dan kontrak, data unit </w:t>
-      </w:r>
-      <w:r>
-        <w:rPr>
-          <w:rFonts w:eastAsia="Times New Roman" w:cs="Times New Roman"/>
-          <w:i/>
-          <w:iCs/>
-          <w:color w:val="1A1A1A"/>
+        <w:t xml:space="preserve">: (1) aplikasi dengan modul kegiatan–kontrak–pekerjaan, unit </w:t>
+      </w:r>
+      <w:r>
+        <w:rPr>
+          <w:rFonts w:eastAsia="Times New Roman" w:cs="Times New Roman"/>
+          <w:color w:val="1A1A1A"/>
+          <w:i/>
+          <w:iCs/>
         </w:rPr>
         <w:t>SPAM</w:t>
       </w:r>
@@ -1814,14 +2433,30 @@
           <w:rFonts w:eastAsia="Times New Roman" w:cs="Times New Roman"/>
           <w:color w:val="1A1A1A"/>
         </w:rPr>
-        <w:t xml:space="preserve"> dan sanitasi, penandaan kelengkapan data, serta fitur pengawasan lapangan; (2) halaman informasi terbuka berisi peta capaian Standar Pelayanan Minimum (SPM) per desa; (3) data terintegrasi memuat 558 pekerjaan, 364 unit </w:t>
-      </w:r>
-      <w:r>
-        <w:rPr>
-          <w:rFonts w:eastAsia="Times New Roman" w:cs="Times New Roman"/>
-          <w:i/>
-          <w:iCs/>
-          <w:color w:val="1A1A1A"/>
+        <w:t>, sanitasi/SPM, pengawasan lapangan, PUSPEN/</w:t>
+      </w:r>
+      <w:r>
+        <w:rPr>
+          <w:rFonts w:eastAsia="Times New Roman" w:cs="Times New Roman"/>
+          <w:color w:val="1A1A1A"/>
+          <w:i/>
+          <w:iCs/>
+        </w:rPr>
+        <w:t>KPI</w:t>
+      </w:r>
+      <w:r>
+        <w:rPr>
+          <w:rFonts w:eastAsia="Times New Roman" w:cs="Times New Roman"/>
+          <w:color w:val="1A1A1A"/>
+        </w:rPr>
+        <w:t xml:space="preserve">, dan publikasi peta capaian; (2) data terintegrasi 558 pekerjaan, 364 unit </w:t>
+      </w:r>
+      <w:r>
+        <w:rPr>
+          <w:rFonts w:eastAsia="Times New Roman" w:cs="Times New Roman"/>
+          <w:color w:val="1A1A1A"/>
+          <w:i/>
+          <w:iCs/>
         </w:rPr>
         <w:t>SPAM</w:t>
       </w:r>
@@ -1830,7 +2465,103 @@
           <w:rFonts w:eastAsia="Times New Roman" w:cs="Times New Roman"/>
           <w:color w:val="1A1A1A"/>
         </w:rPr>
-        <w:t>, 162 infrastruktur sanitasi, 6.453 foto dokumentasi, dan 508 catatan capaian (2009–2026).</w:t>
+        <w:t xml:space="preserve">, 167 infrastruktur sanitasi, 6.787 foto, serta 512 catatan capaian (2009–2026). </w:t>
+      </w:r>
+      <w:r>
+        <w:rPr>
+          <w:rFonts w:eastAsia="Times New Roman" w:cs="Times New Roman"/>
+          <w:color w:val="1A1A1A"/>
+          <w:i/>
+          <w:iCs/>
+        </w:rPr>
+        <w:t>Outcome</w:t>
+      </w:r>
+      <w:r>
+        <w:rPr>
+          <w:rFonts w:eastAsia="Times New Roman" w:cs="Times New Roman"/>
+          <w:color w:val="1A1A1A"/>
+        </w:rPr>
+        <w:t xml:space="preserve"> operasional terukur (13 Juli 2026): rekap Standar Pelayanan Minimum (SPM) dari titik tengah 7,5 HK manual menjadi median 2,3 detik (same-day / &lt;0,1 HK) (efisiensi ≈ 98,7%); interval </w:t>
+      </w:r>
+      <w:r>
+        <w:rPr>
+          <w:rFonts w:eastAsia="Times New Roman" w:cs="Times New Roman"/>
+          <w:color w:val="1A1A1A"/>
+          <w:i/>
+          <w:iCs/>
+        </w:rPr>
+        <w:t>update</w:t>
+      </w:r>
+      <w:r>
+        <w:rPr>
+          <w:rFonts w:eastAsia="Times New Roman" w:cs="Times New Roman"/>
+          <w:color w:val="1A1A1A"/>
+        </w:rPr>
+        <w:t xml:space="preserve"> progres dari titik tengah 21 hari manual menjadi median 12 hari (efisiensi ≈ 42,9%); 29 pengawas / 33 lokasi; 83,9% paket </w:t>
+      </w:r>
+      <w:r>
+        <w:rPr>
+          <w:rFonts w:eastAsia="Times New Roman" w:cs="Times New Roman"/>
+          <w:color w:val="1A1A1A"/>
+          <w:i/>
+          <w:iCs/>
+        </w:rPr>
+        <w:t>progress</w:t>
+      </w:r>
+      <w:r>
+        <w:rPr>
+          <w:rFonts w:eastAsia="Times New Roman" w:cs="Times New Roman"/>
+          <w:color w:val="1A1A1A"/>
+        </w:rPr>
+        <w:t xml:space="preserve"> fisik terbarui ≤30 hari. Keberlanjutan 2026–2028, SOP/SK, perlindungan data (akses berjenjang, sesi aman, </w:t>
+      </w:r>
+      <w:r>
+        <w:rPr>
+          <w:rFonts w:eastAsia="Times New Roman" w:cs="Times New Roman"/>
+          <w:color w:val="1A1A1A"/>
+          <w:i/>
+          <w:iCs/>
+        </w:rPr>
+        <w:t>audit log</w:t>
+      </w:r>
+      <w:r>
+        <w:rPr>
+          <w:rFonts w:eastAsia="Times New Roman" w:cs="Times New Roman"/>
+          <w:color w:val="1A1A1A"/>
+        </w:rPr>
+        <w:t xml:space="preserve">). </w:t>
+      </w:r>
+      <w:r>
+        <w:rPr>
+          <w:rFonts w:eastAsia="Times New Roman" w:cs="Times New Roman"/>
+          <w:color w:val="1A1A1A"/>
+          <w:i/>
+          <w:iCs/>
+        </w:rPr>
+        <w:t>Outcome</w:t>
+      </w:r>
+      <w:r>
+        <w:rPr>
+          <w:rFonts w:eastAsia="Times New Roman" w:cs="Times New Roman"/>
+          <w:color w:val="1A1A1A"/>
+        </w:rPr>
+        <w:t xml:space="preserve"> jangka menengah: penutupan </w:t>
+      </w:r>
+      <w:r>
+        <w:rPr>
+          <w:rFonts w:eastAsia="Times New Roman" w:cs="Times New Roman"/>
+          <w:color w:val="1A1A1A"/>
+          <w:i/>
+          <w:iCs/>
+        </w:rPr>
+        <w:t>gap</w:t>
+      </w:r>
+      <w:r>
+        <w:rPr>
+          <w:rFonts w:eastAsia="Times New Roman" w:cs="Times New Roman"/>
+          <w:color w:val="1A1A1A"/>
+        </w:rPr>
+        <w:t xml:space="preserve"> layanan berbasis prioritas data desa.</w:t>
       </w:r>
     </w:p>
     <w:p>
@@ -1849,7 +2580,7 @@
         <w:ind w:left="4820"/>
       </w:pPr>
       <w:r>
-        <w:t>Cianjur, 6 Juli 2026</w:t>
+        <w:t>Cianjur, 13 Juli 2026</w:t>
       </w:r>
     </w:p>
     <w:tbl>
@@ -1885,11 +2616,7 @@
               <w:jc w:val="center"/>
             </w:pPr>
             <w:r>
-              <w:t xml:space="preserve">Kepala Dinas Perumahan dan </w:t>
-            </w:r>
-            <w:r>
-              <w:br/>
-              <w:t>Kawasan Permukiman Kabupaten Cianjur</w:t>
+              <w:t>Kepala Dinas Perumahan dan Kawasan Permukiman Kabupaten Cianjur</w:t>
             </w:r>
           </w:p>
           <w:p/>
@@ -1900,18 +2627,8 @@
           <w:p>
             <w:pPr>
               <w:jc w:val="center"/>
-              <w:rPr>
-                <w:b/>
-                <w:bCs/>
-                <w:u w:val="single"/>
-              </w:rPr>
             </w:pPr>
             <w:r>
-              <w:rPr>
-                <w:b/>
-                <w:bCs/>
-                <w:u w:val="single"/>
-              </w:rPr>
               <w:t>CEPI RAHMAT FADIANA, ST, MT</w:t>
             </w:r>
           </w:p>
@@ -1920,6 +2637,10 @@
               <w:jc w:val="center"/>
             </w:pPr>
             <w:r>
+              <w:rPr>
+                <w:rFonts w:eastAsia="Times New Roman" w:cs="Times New Roman"/>
+                <w:color w:val="1A1A1A"/>
+              </w:rPr>
               <w:t>NIP. 19700218 199803 1 006</w:t>
             </w:r>
           </w:p>
@@ -1952,114 +2673,32 @@
             <w:pPr>
               <w:jc w:val="center"/>
             </w:pPr>
+          </w:p>
+          <w:p>
+            <w:pPr>
+              <w:jc w:val="center"/>
+            </w:pPr>
+          </w:p>
+          <w:p>
+            <w:pPr>
+              <w:jc w:val="center"/>
+            </w:pPr>
+          </w:p>
+          <w:p>
+            <w:pPr>
+              <w:jc w:val="center"/>
+            </w:pPr>
+          </w:p>
+          <w:p>
+            <w:pPr>
+              <w:jc w:val="center"/>
+            </w:pPr>
+          </w:p>
+          <w:p>
+            <w:pPr>
+              <w:jc w:val="center"/>
+            </w:pPr>
             <w:r>
-              <w:rPr>
-                <w:noProof/>
-              </w:rPr>
-              <w:drawing>
-                <wp:anchor distT="0" distB="0" distL="114300" distR="114300" simplePos="0" relativeHeight="251659264" behindDoc="0" locked="0" layoutInCell="1" allowOverlap="1" wp14:anchorId="69B130DE" wp14:editId="522DF4F9">
-                  <wp:simplePos x="0" y="0"/>
-                  <wp:positionH relativeFrom="column">
-                    <wp:posOffset>223520</wp:posOffset>
-                  </wp:positionH>
-                  <wp:positionV relativeFrom="paragraph">
-                    <wp:posOffset>190500</wp:posOffset>
-                  </wp:positionV>
-                  <wp:extent cx="1758171" cy="589287"/>
-                  <wp:effectExtent l="0" t="0" r="0" b="1270"/>
-                  <wp:wrapNone/>
-                  <wp:docPr id="951659083" name="Picture 1"/>
-                  <wp:cNvGraphicFramePr>
-                    <a:graphicFrameLocks xmlns:a="http://schemas.openxmlformats.org/drawingml/2006/main" noChangeAspect="1"/>
-                  </wp:cNvGraphicFramePr>
-                  <a:graphic xmlns:a="http://schemas.openxmlformats.org/drawingml/2006/main">
-                    <a:graphicData uri="http://schemas.openxmlformats.org/drawingml/2006/picture">
-                      <pic:pic xmlns:pic="http://schemas.openxmlformats.org/drawingml/2006/picture">
-                        <pic:nvPicPr>
-                          <pic:cNvPr id="0" name="Picture 2"/>
-                          <pic:cNvPicPr>
-                            <a:picLocks noChangeAspect="1" noChangeArrowheads="1"/>
-                          </pic:cNvPicPr>
-                        </pic:nvPicPr>
-                        <pic:blipFill rotWithShape="1">
-                          <a:blip r:embed="rId5" cstate="print">
-                            <a:extLst>
-                              <a:ext uri="{28A0092B-C50C-407E-A947-70E740481C1C}">
-                                <a14:useLocalDpi xmlns:a14="http://schemas.microsoft.com/office/drawing/2010/main" val="0"/>
-                              </a:ext>
-                            </a:extLst>
-                          </a:blip>
-                          <a:srcRect l="3597" r="18294" b="33968"/>
-                          <a:stretch>
-                            <a:fillRect/>
-                          </a:stretch>
-                        </pic:blipFill>
-                        <pic:spPr bwMode="auto">
-                          <a:xfrm>
-                            <a:off x="0" y="0"/>
-                            <a:ext cx="1758171" cy="589287"/>
-                          </a:xfrm>
-                          <a:prstGeom prst="rect">
-                            <a:avLst/>
-                          </a:prstGeom>
-                          <a:noFill/>
-                          <a:ln>
-                            <a:noFill/>
-                          </a:ln>
-                          <a:extLst>
-                            <a:ext uri="{53640926-AAD7-44D8-BBD7-CCE9431645EC}">
-                              <a14:shadowObscured xmlns:a14="http://schemas.microsoft.com/office/drawing/2010/main"/>
-                            </a:ext>
-                          </a:extLst>
-                        </pic:spPr>
-                      </pic:pic>
-                    </a:graphicData>
-                  </a:graphic>
-                  <wp14:sizeRelH relativeFrom="page">
-                    <wp14:pctWidth>0</wp14:pctWidth>
-                  </wp14:sizeRelH>
-                  <wp14:sizeRelV relativeFrom="page">
-                    <wp14:pctHeight>0</wp14:pctHeight>
-                  </wp14:sizeRelV>
-                </wp:anchor>
-              </w:drawing>
-            </w:r>
-          </w:p>
-          <w:p>
-            <w:pPr>
-              <w:jc w:val="center"/>
-            </w:pPr>
-          </w:p>
-          <w:p>
-            <w:pPr>
-              <w:jc w:val="center"/>
-            </w:pPr>
-          </w:p>
-          <w:p>
-            <w:pPr>
-              <w:jc w:val="center"/>
-            </w:pPr>
-          </w:p>
-          <w:p>
-            <w:pPr>
-              <w:jc w:val="center"/>
-            </w:pPr>
-          </w:p>
-          <w:p>
-            <w:pPr>
-              <w:jc w:val="center"/>
-              <w:rPr>
-                <w:b/>
-                <w:bCs/>
-                <w:u w:val="single"/>
-              </w:rPr>
-            </w:pPr>
-            <w:r>
-              <w:rPr>
-                <w:b/>
-                <w:bCs/>
-                <w:u w:val="single"/>
-              </w:rPr>
               <w:t>ILHAM TAUFIQ</w:t>
             </w:r>
           </w:p>
@@ -2919,7 +3558,6 @@
   <w:style w:type="character" w:default="1" w:styleId="DefaultParagraphFont">
     <w:name w:val="Default Paragraph Font"/>
     <w:uiPriority w:val="1"/>
-    <w:semiHidden/>
     <w:unhideWhenUsed/>
   </w:style>
   <w:style w:type="table" w:default="1" w:styleId="TableNormal">

</xml_diff>

<commit_message>
docs: update LIDA proposal, SOP drafts, and Monev materials
Refresh proposal/SOP document binaries and add signed SOP plus Monev PDF for submission materials.
</commit_message>
<xml_diff>
--- a/docs/Proposal_Inovasi_Arumanis_LIDA_2026.docx
+++ b/docs/Proposal_Inovasi_Arumanis_LIDA_2026.docx
@@ -546,9 +546,9 @@
             <w:r>
               <w:rPr>
                 <w:rFonts w:eastAsia="Times New Roman" w:cs="Times New Roman"/>
-                <w:color w:val="1A1A1A"/>
                 <w:i/>
                 <w:iCs/>
+                <w:color w:val="1A1A1A"/>
               </w:rPr>
               <w:t>Digital</w:t>
             </w:r>
@@ -571,9 +571,9 @@
             <w:r>
               <w:rPr>
                 <w:rFonts w:eastAsia="Times New Roman" w:cs="Times New Roman"/>
-                <w:color w:val="1A1A1A"/>
                 <w:i/>
                 <w:iCs/>
+                <w:color w:val="1A1A1A"/>
               </w:rPr>
               <w:t>Digital</w:t>
             </w:r>
@@ -715,6 +715,7 @@
                 <w:bCs/>
                 <w:color w:val="1A1A1A"/>
               </w:rPr>
+              <w:lastRenderedPageBreak/>
               <w:t>Titik Koordinat</w:t>
             </w:r>
           </w:p>
@@ -845,7 +846,6 @@
                 <w:bCs/>
                 <w:color w:val="1A1A1A"/>
               </w:rPr>
-              <w:lastRenderedPageBreak/>
               <w:t>Urusan pemerintahan</w:t>
             </w:r>
           </w:p>
@@ -1085,14 +1085,21 @@
         <w:rPr>
           <w:lang w:val="en-ID"/>
         </w:rPr>
-        <w:t xml:space="preserve">BAGIAN II :  RANCANG BANGUN INOVASI </w:t>
-      </w:r>
-      <w:r>
-        <w:rPr>
-          <w:color w:val="EE0000"/>
+        <w:t xml:space="preserve">BAGIAN </w:t>
+      </w:r>
+      <w:proofErr w:type="gramStart"/>
+      <w:r>
+        <w:rPr>
           <w:lang w:val="en-ID"/>
         </w:rPr>
-        <w:t>(minimal 300 kata)</w:t>
+        <w:t>II :</w:t>
+      </w:r>
+      <w:proofErr w:type="gramEnd"/>
+      <w:r>
+        <w:rPr>
+          <w:lang w:val="en-ID"/>
+        </w:rPr>
+        <w:t xml:space="preserve">  RANCANG BANGUN INOVAS</w:t>
       </w:r>
     </w:p>
     <w:p>
@@ -1105,8 +1112,7 @@
     </w:p>
     <w:p>
       <w:pPr>
-        <w:spacing w:before="40" w:after="160" w:line="360" w:lineRule="auto"/>
-        <w:jc w:val="both"/>
+        <w:spacing w:before="40" w:line="360" w:lineRule="auto"/>
       </w:pPr>
       <w:r>
         <w:rPr>
@@ -1118,9 +1124,9 @@
       <w:r>
         <w:rPr>
           <w:rFonts w:eastAsia="Times New Roman" w:cs="Times New Roman"/>
-          <w:color w:val="1A1A1A"/>
-          <w:i/>
-          <w:iCs/>
+          <w:i/>
+          <w:iCs/>
+          <w:color w:val="1A1A1A"/>
         </w:rPr>
         <w:t>SPAM</w:t>
       </w:r>
@@ -1134,9 +1140,9 @@
       <w:r>
         <w:rPr>
           <w:rFonts w:eastAsia="Times New Roman" w:cs="Times New Roman"/>
-          <w:color w:val="1A1A1A"/>
-          <w:i/>
-          <w:iCs/>
+          <w:i/>
+          <w:iCs/>
+          <w:color w:val="1A1A1A"/>
         </w:rPr>
         <w:t>SPBE</w:t>
       </w:r>
@@ -1150,9 +1156,9 @@
       <w:r>
         <w:rPr>
           <w:rFonts w:eastAsia="Times New Roman" w:cs="Times New Roman"/>
-          <w:color w:val="1A1A1A"/>
-          <w:i/>
-          <w:iCs/>
+          <w:i/>
+          <w:iCs/>
+          <w:color w:val="1A1A1A"/>
         </w:rPr>
         <w:t>PAMSIMAS</w:t>
       </w:r>
@@ -1166,9 +1172,9 @@
       <w:r>
         <w:rPr>
           <w:rFonts w:eastAsia="Times New Roman" w:cs="Times New Roman"/>
-          <w:color w:val="1A1A1A"/>
-          <w:i/>
-          <w:iCs/>
+          <w:i/>
+          <w:iCs/>
+          <w:color w:val="1A1A1A"/>
         </w:rPr>
         <w:t>RPJMD</w:t>
       </w:r>
@@ -1182,9 +1188,9 @@
       <w:r>
         <w:rPr>
           <w:rFonts w:eastAsia="Times New Roman" w:cs="Times New Roman"/>
-          <w:color w:val="1A1A1A"/>
-          <w:i/>
-          <w:iCs/>
+          <w:i/>
+          <w:iCs/>
+          <w:color w:val="1A1A1A"/>
         </w:rPr>
         <w:t>RISPAM</w:t>
       </w:r>
@@ -1198,9 +1204,9 @@
       <w:r>
         <w:rPr>
           <w:rFonts w:eastAsia="Times New Roman" w:cs="Times New Roman"/>
-          <w:color w:val="1A1A1A"/>
-          <w:i/>
-          <w:iCs/>
+          <w:i/>
+          <w:iCs/>
+          <w:color w:val="1A1A1A"/>
         </w:rPr>
         <w:t>httpOnly</w:t>
       </w:r>
@@ -1214,9 +1220,9 @@
       <w:r>
         <w:rPr>
           <w:rFonts w:eastAsia="Times New Roman" w:cs="Times New Roman"/>
-          <w:color w:val="1A1A1A"/>
-          <w:i/>
-          <w:iCs/>
+          <w:i/>
+          <w:iCs/>
+          <w:color w:val="1A1A1A"/>
         </w:rPr>
         <w:t>audit log</w:t>
       </w:r>
@@ -1238,22 +1244,22 @@
     </w:p>
     <w:p>
       <w:pPr>
-        <w:spacing w:before="40" w:after="160" w:line="360" w:lineRule="auto"/>
-        <w:jc w:val="both"/>
-      </w:pPr>
-      <w:r>
-        <w:rPr>
-          <w:rFonts w:eastAsia="Times New Roman" w:cs="Times New Roman"/>
-          <w:color w:val="1A1A1A"/>
-        </w:rPr>
+        <w:spacing w:before="40" w:line="360" w:lineRule="auto"/>
+      </w:pPr>
+      <w:r>
+        <w:rPr>
+          <w:rFonts w:eastAsia="Times New Roman" w:cs="Times New Roman"/>
+          <w:color w:val="1A1A1A"/>
+        </w:rPr>
+        <w:lastRenderedPageBreak/>
         <w:t xml:space="preserve">Makro: Kabupaten Cianjur berpenduduk 2.535.002 jiwa (33 kecamatan, 365 desa/kelurahan) masih menghadapi kesenjangan akses air minum layak dan sanitasi. Per 08 Juli 2026, capaian Standar Pelayanan Minimum (SPM) air minum 13,26% (481.703 KK belum terlayani) dan sanitasi 1,92% (255 desa belum berinfrastruktur terpetakan). Mikro (tata kelola data): (1) progres fisik–keuangan–dokumentasi lapangan tercecer di </w:t>
       </w:r>
       <w:r>
         <w:rPr>
           <w:rFonts w:eastAsia="Times New Roman" w:cs="Times New Roman"/>
-          <w:color w:val="1A1A1A"/>
-          <w:i/>
-          <w:iCs/>
+          <w:i/>
+          <w:iCs/>
+          <w:color w:val="1A1A1A"/>
         </w:rPr>
         <w:t>Excel</w:t>
       </w:r>
@@ -1267,9 +1273,9 @@
       <w:r>
         <w:rPr>
           <w:rFonts w:eastAsia="Times New Roman" w:cs="Times New Roman"/>
-          <w:color w:val="1A1A1A"/>
-          <w:i/>
-          <w:iCs/>
+          <w:i/>
+          <w:iCs/>
+          <w:color w:val="1A1A1A"/>
         </w:rPr>
         <w:t>PDF</w:t>
       </w:r>
@@ -1283,9 +1289,9 @@
       <w:r>
         <w:rPr>
           <w:rFonts w:eastAsia="Times New Roman" w:cs="Times New Roman"/>
-          <w:color w:val="1A1A1A"/>
-          <w:i/>
-          <w:iCs/>
+          <w:i/>
+          <w:iCs/>
+          <w:color w:val="1A1A1A"/>
         </w:rPr>
         <w:t>WhatsApp</w:t>
       </w:r>
@@ -1299,9 +1305,9 @@
       <w:r>
         <w:rPr>
           <w:rFonts w:eastAsia="Times New Roman" w:cs="Times New Roman"/>
-          <w:color w:val="1A1A1A"/>
-          <w:i/>
-          <w:iCs/>
+          <w:i/>
+          <w:iCs/>
+          <w:color w:val="1A1A1A"/>
         </w:rPr>
         <w:t>single source of truth</w:t>
       </w:r>
@@ -1315,9 +1321,9 @@
       <w:r>
         <w:rPr>
           <w:rFonts w:eastAsia="Times New Roman" w:cs="Times New Roman"/>
-          <w:color w:val="1A1A1A"/>
-          <w:i/>
-          <w:iCs/>
+          <w:i/>
+          <w:iCs/>
+          <w:color w:val="1A1A1A"/>
         </w:rPr>
         <w:t>deviasi</w:t>
       </w:r>
@@ -1339,8 +1345,7 @@
     </w:p>
     <w:p>
       <w:pPr>
-        <w:spacing w:before="40" w:after="160" w:line="360" w:lineRule="auto"/>
-        <w:jc w:val="both"/>
+        <w:spacing w:before="40" w:line="360" w:lineRule="auto"/>
       </w:pPr>
       <w:r>
         <w:rPr>
@@ -1352,9 +1357,9 @@
       <w:r>
         <w:rPr>
           <w:rFonts w:eastAsia="Times New Roman" w:cs="Times New Roman"/>
-          <w:color w:val="1A1A1A"/>
-          <w:i/>
-          <w:iCs/>
+          <w:i/>
+          <w:iCs/>
+          <w:color w:val="1A1A1A"/>
         </w:rPr>
         <w:t>SDGs</w:t>
       </w:r>
@@ -1368,9 +1373,9 @@
       <w:r>
         <w:rPr>
           <w:rFonts w:eastAsia="Times New Roman" w:cs="Times New Roman"/>
-          <w:color w:val="1A1A1A"/>
-          <w:i/>
-          <w:iCs/>
+          <w:i/>
+          <w:iCs/>
+          <w:color w:val="1A1A1A"/>
         </w:rPr>
         <w:t>RPJMN</w:t>
       </w:r>
@@ -1384,9 +1389,9 @@
       <w:r>
         <w:rPr>
           <w:rFonts w:eastAsia="Times New Roman" w:cs="Times New Roman"/>
-          <w:color w:val="1A1A1A"/>
-          <w:i/>
-          <w:iCs/>
+          <w:i/>
+          <w:iCs/>
+          <w:color w:val="1A1A1A"/>
         </w:rPr>
         <w:t>PAMSIMAS</w:t>
       </w:r>
@@ -1400,9 +1405,9 @@
       <w:r>
         <w:rPr>
           <w:rFonts w:eastAsia="Times New Roman" w:cs="Times New Roman"/>
-          <w:color w:val="1A1A1A"/>
-          <w:i/>
-          <w:iCs/>
+          <w:i/>
+          <w:iCs/>
+          <w:color w:val="1A1A1A"/>
         </w:rPr>
         <w:t>SPBE</w:t>
       </w:r>
@@ -1416,9 +1421,9 @@
       <w:r>
         <w:rPr>
           <w:rFonts w:eastAsia="Times New Roman" w:cs="Times New Roman"/>
-          <w:color w:val="1A1A1A"/>
-          <w:i/>
-          <w:iCs/>
+          <w:i/>
+          <w:iCs/>
+          <w:color w:val="1A1A1A"/>
         </w:rPr>
         <w:t>RPJMD</w:t>
       </w:r>
@@ -1432,9 +1437,9 @@
       <w:r>
         <w:rPr>
           <w:rFonts w:eastAsia="Times New Roman" w:cs="Times New Roman"/>
-          <w:color w:val="1A1A1A"/>
-          <w:i/>
-          <w:iCs/>
+          <w:i/>
+          <w:iCs/>
+          <w:color w:val="1A1A1A"/>
         </w:rPr>
         <w:t>RISPAM</w:t>
       </w:r>
@@ -1448,9 +1453,9 @@
       <w:r>
         <w:rPr>
           <w:rFonts w:eastAsia="Times New Roman" w:cs="Times New Roman"/>
-          <w:color w:val="1A1A1A"/>
-          <w:i/>
-          <w:iCs/>
+          <w:i/>
+          <w:iCs/>
+          <w:color w:val="1A1A1A"/>
         </w:rPr>
         <w:t>PAMSIMAS</w:t>
       </w:r>
@@ -1464,9 +1469,9 @@
       <w:r>
         <w:rPr>
           <w:rFonts w:eastAsia="Times New Roman" w:cs="Times New Roman"/>
-          <w:color w:val="1A1A1A"/>
-          <w:i/>
-          <w:iCs/>
+          <w:i/>
+          <w:iCs/>
+          <w:color w:val="1A1A1A"/>
         </w:rPr>
         <w:t>gap</w:t>
       </w:r>
@@ -1488,8 +1493,7 @@
     </w:p>
     <w:p>
       <w:pPr>
-        <w:spacing w:before="40" w:after="160" w:line="360" w:lineRule="auto"/>
-        <w:jc w:val="both"/>
+        <w:spacing w:before="40" w:line="360" w:lineRule="auto"/>
       </w:pPr>
       <w:r>
         <w:rPr>
@@ -1501,9 +1505,9 @@
       <w:r>
         <w:rPr>
           <w:rFonts w:eastAsia="Times New Roman" w:cs="Times New Roman"/>
-          <w:color w:val="1A1A1A"/>
-          <w:i/>
-          <w:iCs/>
+          <w:i/>
+          <w:iCs/>
+          <w:color w:val="1A1A1A"/>
         </w:rPr>
         <w:t>SPAM</w:t>
       </w:r>
@@ -1517,9 +1521,9 @@
       <w:r>
         <w:rPr>
           <w:rFonts w:eastAsia="Times New Roman" w:cs="Times New Roman"/>
-          <w:color w:val="1A1A1A"/>
-          <w:i/>
-          <w:iCs/>
+          <w:i/>
+          <w:iCs/>
+          <w:color w:val="1A1A1A"/>
         </w:rPr>
         <w:t>audit log</w:t>
       </w:r>
@@ -1533,9 +1537,9 @@
       <w:r>
         <w:rPr>
           <w:rFonts w:eastAsia="Times New Roman" w:cs="Times New Roman"/>
-          <w:color w:val="1A1A1A"/>
-          <w:i/>
-          <w:iCs/>
+          <w:i/>
+          <w:iCs/>
+          <w:color w:val="1A1A1A"/>
         </w:rPr>
         <w:t>Excel</w:t>
       </w:r>
@@ -1549,9 +1553,9 @@
       <w:r>
         <w:rPr>
           <w:rFonts w:eastAsia="Times New Roman" w:cs="Times New Roman"/>
-          <w:color w:val="1A1A1A"/>
-          <w:i/>
-          <w:iCs/>
+          <w:i/>
+          <w:iCs/>
+          <w:color w:val="1A1A1A"/>
         </w:rPr>
         <w:t>PDF</w:t>
       </w:r>
@@ -1565,9 +1569,9 @@
       <w:r>
         <w:rPr>
           <w:rFonts w:eastAsia="Times New Roman" w:cs="Times New Roman"/>
-          <w:color w:val="1A1A1A"/>
-          <w:i/>
-          <w:iCs/>
+          <w:i/>
+          <w:iCs/>
+          <w:color w:val="1A1A1A"/>
         </w:rPr>
         <w:t>WhatsApp</w:t>
       </w:r>
@@ -1581,9 +1585,9 @@
       <w:r>
         <w:rPr>
           <w:rFonts w:eastAsia="Times New Roman" w:cs="Times New Roman"/>
-          <w:color w:val="1A1A1A"/>
-          <w:i/>
-          <w:iCs/>
+          <w:i/>
+          <w:iCs/>
+          <w:color w:val="1A1A1A"/>
         </w:rPr>
         <w:t>digital</w:t>
       </w:r>
@@ -1597,9 +1601,9 @@
       <w:r>
         <w:rPr>
           <w:rFonts w:eastAsia="Times New Roman" w:cs="Times New Roman"/>
-          <w:color w:val="1A1A1A"/>
-          <w:i/>
-          <w:iCs/>
+          <w:i/>
+          <w:iCs/>
+          <w:color w:val="1A1A1A"/>
         </w:rPr>
         <w:t>dashboard</w:t>
       </w:r>
@@ -1613,9 +1617,9 @@
       <w:r>
         <w:rPr>
           <w:rFonts w:eastAsia="Times New Roman" w:cs="Times New Roman"/>
-          <w:color w:val="1A1A1A"/>
-          <w:i/>
-          <w:iCs/>
+          <w:i/>
+          <w:iCs/>
+          <w:color w:val="1A1A1A"/>
         </w:rPr>
         <w:t>API</w:t>
       </w:r>
@@ -1624,14 +1628,22 @@
           <w:rFonts w:eastAsia="Times New Roman" w:cs="Times New Roman"/>
           <w:color w:val="1A1A1A"/>
         </w:rPr>
-        <w:t xml:space="preserve"> stats air minum + sanitasi + </w:t>
-      </w:r>
-      <w:r>
-        <w:rPr>
-          <w:rFonts w:eastAsia="Times New Roman" w:cs="Times New Roman"/>
-          <w:color w:val="1A1A1A"/>
-          <w:i/>
-          <w:iCs/>
+        <w:t xml:space="preserve"> stats air </w:t>
+      </w:r>
+      <w:r>
+        <w:rPr>
+          <w:rFonts w:eastAsia="Times New Roman" w:cs="Times New Roman"/>
+          <w:color w:val="1A1A1A"/>
+        </w:rPr>
+        <w:lastRenderedPageBreak/>
+        <w:t xml:space="preserve">minum + sanitasi + </w:t>
+      </w:r>
+      <w:r>
+        <w:rPr>
+          <w:rFonts w:eastAsia="Times New Roman" w:cs="Times New Roman"/>
+          <w:i/>
+          <w:iCs/>
+          <w:color w:val="1A1A1A"/>
         </w:rPr>
         <w:t>dashboard</w:t>
       </w:r>
@@ -1645,9 +1657,9 @@
       <w:r>
         <w:rPr>
           <w:rFonts w:eastAsia="Times New Roman" w:cs="Times New Roman"/>
-          <w:color w:val="1A1A1A"/>
-          <w:i/>
-          <w:iCs/>
+          <w:i/>
+          <w:iCs/>
+          <w:color w:val="1A1A1A"/>
         </w:rPr>
         <w:t>update</w:t>
       </w:r>
@@ -1661,9 +1673,9 @@
       <w:r>
         <w:rPr>
           <w:rFonts w:eastAsia="Times New Roman" w:cs="Times New Roman"/>
-          <w:color w:val="1A1A1A"/>
-          <w:i/>
-          <w:iCs/>
+          <w:i/>
+          <w:iCs/>
+          <w:color w:val="1A1A1A"/>
         </w:rPr>
         <w:t>audit log</w:t>
       </w:r>
@@ -1677,9 +1689,9 @@
       <w:r>
         <w:rPr>
           <w:rFonts w:eastAsia="Times New Roman" w:cs="Times New Roman"/>
-          <w:color w:val="1A1A1A"/>
-          <w:i/>
-          <w:iCs/>
+          <w:i/>
+          <w:iCs/>
+          <w:color w:val="1A1A1A"/>
         </w:rPr>
         <w:t>Progress</w:t>
       </w:r>
@@ -1693,9 +1705,9 @@
       <w:r>
         <w:rPr>
           <w:rFonts w:eastAsia="Times New Roman" w:cs="Times New Roman"/>
-          <w:color w:val="1A1A1A"/>
-          <w:i/>
-          <w:iCs/>
+          <w:i/>
+          <w:iCs/>
+          <w:color w:val="1A1A1A"/>
         </w:rPr>
         <w:t>update</w:t>
       </w:r>
@@ -1709,9 +1721,9 @@
       <w:r>
         <w:rPr>
           <w:rFonts w:eastAsia="Times New Roman" w:cs="Times New Roman"/>
-          <w:color w:val="1A1A1A"/>
-          <w:i/>
-          <w:iCs/>
+          <w:i/>
+          <w:iCs/>
+          <w:color w:val="1A1A1A"/>
         </w:rPr>
         <w:t>Progress</w:t>
       </w:r>
@@ -1725,9 +1737,9 @@
       <w:r>
         <w:rPr>
           <w:rFonts w:eastAsia="Times New Roman" w:cs="Times New Roman"/>
-          <w:color w:val="1A1A1A"/>
-          <w:i/>
-          <w:iCs/>
+          <w:i/>
+          <w:iCs/>
+          <w:color w:val="1A1A1A"/>
         </w:rPr>
         <w:t>snapshot</w:t>
       </w:r>
@@ -1741,9 +1753,9 @@
       <w:r>
         <w:rPr>
           <w:rFonts w:eastAsia="Times New Roman" w:cs="Times New Roman"/>
-          <w:color w:val="1A1A1A"/>
-          <w:i/>
-          <w:iCs/>
+          <w:i/>
+          <w:iCs/>
+          <w:color w:val="1A1A1A"/>
         </w:rPr>
         <w:t>progress</w:t>
       </w:r>
@@ -1757,9 +1769,9 @@
       <w:r>
         <w:rPr>
           <w:rFonts w:eastAsia="Times New Roman" w:cs="Times New Roman"/>
-          <w:color w:val="1A1A1A"/>
-          <w:i/>
-          <w:iCs/>
+          <w:i/>
+          <w:iCs/>
+          <w:color w:val="1A1A1A"/>
         </w:rPr>
         <w:t>update</w:t>
       </w:r>
@@ -1773,9 +1785,9 @@
       <w:r>
         <w:rPr>
           <w:rFonts w:eastAsia="Times New Roman" w:cs="Times New Roman"/>
-          <w:color w:val="1A1A1A"/>
-          <w:i/>
-          <w:iCs/>
+          <w:i/>
+          <w:iCs/>
+          <w:color w:val="1A1A1A"/>
         </w:rPr>
         <w:t>KPI</w:t>
       </w:r>
@@ -1789,9 +1801,9 @@
       <w:r>
         <w:rPr>
           <w:rFonts w:eastAsia="Times New Roman" w:cs="Times New Roman"/>
-          <w:color w:val="1A1A1A"/>
-          <w:i/>
-          <w:iCs/>
+          <w:i/>
+          <w:iCs/>
+          <w:color w:val="1A1A1A"/>
         </w:rPr>
         <w:t>audit log</w:t>
       </w:r>
@@ -1805,9 +1817,9 @@
       <w:r>
         <w:rPr>
           <w:rFonts w:eastAsia="Times New Roman" w:cs="Times New Roman"/>
-          <w:color w:val="1A1A1A"/>
-          <w:i/>
-          <w:iCs/>
+          <w:i/>
+          <w:iCs/>
+          <w:color w:val="1A1A1A"/>
         </w:rPr>
         <w:t>SPAM</w:t>
       </w:r>
@@ -1821,9 +1833,9 @@
       <w:r>
         <w:rPr>
           <w:rFonts w:eastAsia="Times New Roman" w:cs="Times New Roman"/>
-          <w:color w:val="1A1A1A"/>
-          <w:i/>
-          <w:iCs/>
+          <w:i/>
+          <w:iCs/>
+          <w:color w:val="1A1A1A"/>
         </w:rPr>
         <w:t>KPI</w:t>
       </w:r>
@@ -1837,9 +1849,9 @@
       <w:r>
         <w:rPr>
           <w:rFonts w:eastAsia="Times New Roman" w:cs="Times New Roman"/>
-          <w:color w:val="1A1A1A"/>
-          <w:i/>
-          <w:iCs/>
+          <w:i/>
+          <w:iCs/>
+          <w:color w:val="1A1A1A"/>
         </w:rPr>
         <w:t>platform</w:t>
       </w:r>
@@ -1861,8 +1873,7 @@
     </w:p>
     <w:p>
       <w:pPr>
-        <w:spacing w:before="40" w:after="160" w:line="360" w:lineRule="auto"/>
-        <w:jc w:val="both"/>
+        <w:spacing w:before="40" w:line="360" w:lineRule="auto"/>
       </w:pPr>
       <w:r>
         <w:rPr>
@@ -1874,9 +1885,9 @@
       <w:r>
         <w:rPr>
           <w:rFonts w:eastAsia="Times New Roman" w:cs="Times New Roman"/>
-          <w:color w:val="1A1A1A"/>
-          <w:i/>
-          <w:iCs/>
+          <w:i/>
+          <w:iCs/>
+          <w:color w:val="1A1A1A"/>
         </w:rPr>
         <w:t>SPAM</w:t>
       </w:r>
@@ -1890,9 +1901,9 @@
       <w:r>
         <w:rPr>
           <w:rFonts w:eastAsia="Times New Roman" w:cs="Times New Roman"/>
-          <w:color w:val="1A1A1A"/>
-          <w:i/>
-          <w:iCs/>
+          <w:i/>
+          <w:iCs/>
+          <w:color w:val="1A1A1A"/>
         </w:rPr>
         <w:t>SIMSPAM</w:t>
       </w:r>
@@ -1906,9 +1917,9 @@
       <w:r>
         <w:rPr>
           <w:rFonts w:eastAsia="Times New Roman" w:cs="Times New Roman"/>
-          <w:color w:val="1A1A1A"/>
-          <w:i/>
-          <w:iCs/>
+          <w:i/>
+          <w:iCs/>
+          <w:color w:val="1A1A1A"/>
         </w:rPr>
         <w:t>GPS</w:t>
       </w:r>
@@ -1922,9 +1933,9 @@
       <w:r>
         <w:rPr>
           <w:rFonts w:eastAsia="Times New Roman" w:cs="Times New Roman"/>
-          <w:color w:val="1A1A1A"/>
-          <w:i/>
-          <w:iCs/>
+          <w:i/>
+          <w:iCs/>
+          <w:color w:val="1A1A1A"/>
         </w:rPr>
         <w:t>KPI</w:t>
       </w:r>
@@ -1938,9 +1949,9 @@
       <w:r>
         <w:rPr>
           <w:rFonts w:eastAsia="Times New Roman" w:cs="Times New Roman"/>
-          <w:color w:val="1A1A1A"/>
-          <w:i/>
-          <w:iCs/>
+          <w:i/>
+          <w:iCs/>
+          <w:color w:val="1A1A1A"/>
         </w:rPr>
         <w:t>platform</w:t>
       </w:r>
@@ -1954,9 +1965,9 @@
       <w:r>
         <w:rPr>
           <w:rFonts w:eastAsia="Times New Roman" w:cs="Times New Roman"/>
-          <w:color w:val="1A1A1A"/>
-          <w:i/>
-          <w:iCs/>
+          <w:i/>
+          <w:iCs/>
+          <w:color w:val="1A1A1A"/>
         </w:rPr>
         <w:t>SIMSPAM</w:t>
       </w:r>
@@ -1970,9 +1981,9 @@
       <w:r>
         <w:rPr>
           <w:rFonts w:eastAsia="Times New Roman" w:cs="Times New Roman"/>
-          <w:color w:val="1A1A1A"/>
-          <w:i/>
-          <w:iCs/>
+          <w:i/>
+          <w:iCs/>
+          <w:color w:val="1A1A1A"/>
         </w:rPr>
         <w:t>role-based access</w:t>
       </w:r>
@@ -1986,9 +1997,9 @@
       <w:r>
         <w:rPr>
           <w:rFonts w:eastAsia="Times New Roman" w:cs="Times New Roman"/>
-          <w:color w:val="1A1A1A"/>
-          <w:i/>
-          <w:iCs/>
+          <w:i/>
+          <w:iCs/>
+          <w:color w:val="1A1A1A"/>
         </w:rPr>
         <w:t>audit log</w:t>
       </w:r>
@@ -2002,9 +2013,9 @@
       <w:r>
         <w:rPr>
           <w:rFonts w:eastAsia="Times New Roman" w:cs="Times New Roman"/>
-          <w:color w:val="1A1A1A"/>
-          <w:i/>
-          <w:iCs/>
+          <w:i/>
+          <w:iCs/>
+          <w:color w:val="1A1A1A"/>
         </w:rPr>
         <w:t>baseline</w:t>
       </w:r>
@@ -2018,9 +2029,9 @@
       <w:r>
         <w:rPr>
           <w:rFonts w:eastAsia="Times New Roman" w:cs="Times New Roman"/>
-          <w:color w:val="1A1A1A"/>
-          <w:i/>
-          <w:iCs/>
+          <w:i/>
+          <w:iCs/>
+          <w:color w:val="1A1A1A"/>
         </w:rPr>
         <w:t>deviasi</w:t>
       </w:r>
@@ -2042,8 +2053,7 @@
     </w:p>
     <w:p>
       <w:pPr>
-        <w:spacing w:before="40" w:after="160" w:line="360" w:lineRule="auto"/>
-        <w:jc w:val="both"/>
+        <w:spacing w:before="40" w:line="360" w:lineRule="auto"/>
       </w:pPr>
       <w:r>
         <w:rPr>
@@ -2055,9 +2065,9 @@
       <w:r>
         <w:rPr>
           <w:rFonts w:eastAsia="Times New Roman" w:cs="Times New Roman"/>
-          <w:color w:val="1A1A1A"/>
-          <w:i/>
-          <w:iCs/>
+          <w:i/>
+          <w:iCs/>
+          <w:color w:val="1A1A1A"/>
         </w:rPr>
         <w:t>SPAM</w:t>
       </w:r>
@@ -2071,9 +2081,9 @@
       <w:r>
         <w:rPr>
           <w:rFonts w:eastAsia="Times New Roman" w:cs="Times New Roman"/>
-          <w:color w:val="1A1A1A"/>
-          <w:i/>
-          <w:iCs/>
+          <w:i/>
+          <w:iCs/>
+          <w:color w:val="1A1A1A"/>
         </w:rPr>
         <w:t>KPI</w:t>
       </w:r>
@@ -2087,9 +2097,9 @@
       <w:r>
         <w:rPr>
           <w:rFonts w:eastAsia="Times New Roman" w:cs="Times New Roman"/>
-          <w:color w:val="1A1A1A"/>
-          <w:i/>
-          <w:iCs/>
+          <w:i/>
+          <w:iCs/>
+          <w:color w:val="1A1A1A"/>
         </w:rPr>
         <w:t>output</w:t>
       </w:r>
@@ -2111,6 +2121,7 @@
         <w:ind w:left="360" w:hanging="360"/>
       </w:pPr>
       <w:r>
+        <w:lastRenderedPageBreak/>
         <w:t>BAGIAN III. TUJUAN MANFAAT DAN HASIL</w:t>
       </w:r>
     </w:p>
@@ -2124,9 +2135,8 @@
     </w:p>
     <w:p>
       <w:pPr>
-        <w:spacing w:before="40" w:after="160" w:line="360" w:lineRule="auto"/>
+        <w:spacing w:before="40" w:line="360" w:lineRule="auto"/>
         <w:ind w:left="360"/>
-        <w:jc w:val="both"/>
       </w:pPr>
       <w:r>
         <w:rPr>
@@ -2138,9 +2148,9 @@
       <w:r>
         <w:rPr>
           <w:rFonts w:eastAsia="Times New Roman" w:cs="Times New Roman"/>
-          <w:color w:val="1A1A1A"/>
-          <w:i/>
-          <w:iCs/>
+          <w:i/>
+          <w:iCs/>
+          <w:color w:val="1A1A1A"/>
         </w:rPr>
         <w:t>SPAM</w:t>
       </w:r>
@@ -2154,9 +2164,9 @@
       <w:r>
         <w:rPr>
           <w:rFonts w:eastAsia="Times New Roman" w:cs="Times New Roman"/>
-          <w:color w:val="1A1A1A"/>
-          <w:i/>
-          <w:iCs/>
+          <w:i/>
+          <w:iCs/>
+          <w:color w:val="1A1A1A"/>
         </w:rPr>
         <w:t>deviasi</w:t>
       </w:r>
@@ -2170,9 +2180,9 @@
       <w:r>
         <w:rPr>
           <w:rFonts w:eastAsia="Times New Roman" w:cs="Times New Roman"/>
-          <w:color w:val="1A1A1A"/>
-          <w:i/>
-          <w:iCs/>
+          <w:i/>
+          <w:iCs/>
+          <w:color w:val="1A1A1A"/>
         </w:rPr>
         <w:t>baseline</w:t>
       </w:r>
@@ -2186,9 +2196,9 @@
       <w:r>
         <w:rPr>
           <w:rFonts w:eastAsia="Times New Roman" w:cs="Times New Roman"/>
-          <w:color w:val="1A1A1A"/>
-          <w:i/>
-          <w:iCs/>
+          <w:i/>
+          <w:iCs/>
+          <w:color w:val="1A1A1A"/>
         </w:rPr>
         <w:t>update</w:t>
       </w:r>
@@ -2202,9 +2212,9 @@
       <w:r>
         <w:rPr>
           <w:rFonts w:eastAsia="Times New Roman" w:cs="Times New Roman"/>
-          <w:color w:val="1A1A1A"/>
-          <w:i/>
-          <w:iCs/>
+          <w:i/>
+          <w:iCs/>
+          <w:color w:val="1A1A1A"/>
         </w:rPr>
         <w:t>baseline</w:t>
       </w:r>
@@ -2218,9 +2228,9 @@
       <w:r>
         <w:rPr>
           <w:rFonts w:eastAsia="Times New Roman" w:cs="Times New Roman"/>
-          <w:color w:val="1A1A1A"/>
-          <w:i/>
-          <w:iCs/>
+          <w:i/>
+          <w:iCs/>
+          <w:color w:val="1A1A1A"/>
         </w:rPr>
         <w:t>update</w:t>
       </w:r>
@@ -2234,9 +2244,9 @@
       <w:r>
         <w:rPr>
           <w:rFonts w:eastAsia="Times New Roman" w:cs="Times New Roman"/>
-          <w:color w:val="1A1A1A"/>
-          <w:i/>
-          <w:iCs/>
+          <w:i/>
+          <w:iCs/>
+          <w:color w:val="1A1A1A"/>
         </w:rPr>
         <w:t>real-time</w:t>
       </w:r>
@@ -2250,9 +2260,9 @@
       <w:r>
         <w:rPr>
           <w:rFonts w:eastAsia="Times New Roman" w:cs="Times New Roman"/>
-          <w:color w:val="1A1A1A"/>
-          <w:i/>
-          <w:iCs/>
+          <w:i/>
+          <w:iCs/>
+          <w:color w:val="1A1A1A"/>
         </w:rPr>
         <w:t>dashboard</w:t>
       </w:r>
@@ -2266,9 +2276,9 @@
       <w:r>
         <w:rPr>
           <w:rFonts w:eastAsia="Times New Roman" w:cs="Times New Roman"/>
-          <w:color w:val="1A1A1A"/>
-          <w:i/>
-          <w:iCs/>
+          <w:i/>
+          <w:iCs/>
+          <w:color w:val="1A1A1A"/>
         </w:rPr>
         <w:t>Outcome</w:t>
       </w:r>
@@ -2282,9 +2292,9 @@
       <w:r>
         <w:rPr>
           <w:rFonts w:eastAsia="Times New Roman" w:cs="Times New Roman"/>
-          <w:color w:val="1A1A1A"/>
-          <w:i/>
-          <w:iCs/>
+          <w:i/>
+          <w:iCs/>
+          <w:color w:val="1A1A1A"/>
         </w:rPr>
         <w:t>deviasi</w:t>
       </w:r>
@@ -2306,9 +2316,8 @@
     </w:p>
     <w:p>
       <w:pPr>
-        <w:spacing w:before="40" w:after="160" w:line="360" w:lineRule="auto"/>
+        <w:spacing w:before="40" w:line="360" w:lineRule="auto"/>
         <w:ind w:left="360"/>
-        <w:jc w:val="both"/>
       </w:pPr>
       <w:r>
         <w:rPr>
@@ -2320,9 +2329,9 @@
       <w:r>
         <w:rPr>
           <w:rFonts w:eastAsia="Times New Roman" w:cs="Times New Roman"/>
-          <w:color w:val="1A1A1A"/>
-          <w:i/>
-          <w:iCs/>
+          <w:i/>
+          <w:iCs/>
+          <w:color w:val="1A1A1A"/>
         </w:rPr>
         <w:t>deviasi</w:t>
       </w:r>
@@ -2331,14 +2340,28 @@
           <w:rFonts w:eastAsia="Times New Roman" w:cs="Times New Roman"/>
           <w:color w:val="1A1A1A"/>
         </w:rPr>
-        <w:t xml:space="preserve"> fisik–keuangan teridentifikasi lebih awal; evaluasi Standar Pelayanan Minimum (SPM) air minum (13,26%) dan sanitasi (1,92%) berbasis data terpusat; anggaran terpetakan—air minum Rp 92,27 miliar, sanitasi Rp 63,99 miliar, pekerjaan Rp 95,28 miliar (467 kontrak). Pengawas: alur kerja tunggal (progres, foto, tiket) mengurangi ketergantungan </w:t>
-      </w:r>
-      <w:r>
-        <w:rPr>
-          <w:rFonts w:eastAsia="Times New Roman" w:cs="Times New Roman"/>
-          <w:color w:val="1A1A1A"/>
-          <w:i/>
-          <w:iCs/>
+        <w:t xml:space="preserve"> fisik–keuangan teridentifikasi lebih awal; evaluasi Standar Pelayanan Minimum (SPM) air minum (13,26%) dan sanitasi (1,92%) berbasis data terpusat; anggaran terpetakan—air minum, sanitasi</w:t>
+      </w:r>
+      <w:r>
+        <w:rPr>
+          <w:rFonts w:eastAsia="Times New Roman" w:cs="Times New Roman"/>
+          <w:color w:val="1A1A1A"/>
+        </w:rPr>
+        <w:t xml:space="preserve">, </w:t>
+      </w:r>
+      <w:r>
+        <w:rPr>
+          <w:rFonts w:eastAsia="Times New Roman" w:cs="Times New Roman"/>
+          <w:color w:val="1A1A1A"/>
+        </w:rPr>
+        <w:t xml:space="preserve">pekerjaan 467 kontrak. Pengawas: alur kerja tunggal (progres, foto, tiket) mengurangi ketergantungan </w:t>
+      </w:r>
+      <w:r>
+        <w:rPr>
+          <w:rFonts w:eastAsia="Times New Roman" w:cs="Times New Roman"/>
+          <w:i/>
+          <w:iCs/>
+          <w:color w:val="1A1A1A"/>
         </w:rPr>
         <w:t>WhatsApp</w:t>
       </w:r>
@@ -2347,14 +2370,28 @@
           <w:rFonts w:eastAsia="Times New Roman" w:cs="Times New Roman"/>
           <w:color w:val="1A1A1A"/>
         </w:rPr>
-        <w:t xml:space="preserve">/berkas lepas. Masyarakat: cek capaian per desa kapan saja tanpa ke kantor dinas—manfaat keterbukaan menjangkau 2.535.002 jiwa di 33 kecamatan. Institusi: jejak </w:t>
-      </w:r>
-      <w:r>
-        <w:rPr>
-          <w:rFonts w:eastAsia="Times New Roman" w:cs="Times New Roman"/>
-          <w:color w:val="1A1A1A"/>
-          <w:i/>
-          <w:iCs/>
+        <w:t xml:space="preserve">/berkas lepas. Masyarakat: cek capaian per desa kapan saja tanpa ke kantor dinas—manfaat keterbukaan menjangkau 2.535.002 jiwa di </w:t>
+      </w:r>
+      <w:r>
+        <w:rPr>
+          <w:rFonts w:eastAsia="Times New Roman" w:cs="Times New Roman"/>
+          <w:color w:val="1A1A1A"/>
+        </w:rPr>
+        <w:t>seluruh</w:t>
+      </w:r>
+      <w:r>
+        <w:rPr>
+          <w:rFonts w:eastAsia="Times New Roman" w:cs="Times New Roman"/>
+          <w:color w:val="1A1A1A"/>
+        </w:rPr>
+        <w:t xml:space="preserve"> kecamatan. Institusi: jejak </w:t>
+      </w:r>
+      <w:r>
+        <w:rPr>
+          <w:rFonts w:eastAsia="Times New Roman" w:cs="Times New Roman"/>
+          <w:i/>
+          <w:iCs/>
+          <w:color w:val="1A1A1A"/>
         </w:rPr>
         <w:t>digital</w:t>
       </w:r>
@@ -2376,9 +2413,8 @@
     </w:p>
     <w:p>
       <w:pPr>
-        <w:spacing w:before="40" w:after="160" w:line="360" w:lineRule="auto"/>
+        <w:spacing w:before="40" w:line="360" w:lineRule="auto"/>
         <w:ind w:left="360"/>
-        <w:jc w:val="both"/>
       </w:pPr>
       <w:r>
         <w:rPr>
@@ -2390,9 +2426,9 @@
       <w:r>
         <w:rPr>
           <w:rFonts w:eastAsia="Times New Roman" w:cs="Times New Roman"/>
-          <w:color w:val="1A1A1A"/>
-          <w:i/>
-          <w:iCs/>
+          <w:i/>
+          <w:iCs/>
+          <w:color w:val="1A1A1A"/>
         </w:rPr>
         <w:t>platform</w:t>
       </w:r>
@@ -2406,9 +2442,9 @@
       <w:r>
         <w:rPr>
           <w:rFonts w:eastAsia="Times New Roman" w:cs="Times New Roman"/>
-          <w:color w:val="1A1A1A"/>
-          <w:i/>
-          <w:iCs/>
+          <w:i/>
+          <w:iCs/>
+          <w:color w:val="1A1A1A"/>
         </w:rPr>
         <w:t>Output</w:t>
       </w:r>
@@ -2422,9 +2458,9 @@
       <w:r>
         <w:rPr>
           <w:rFonts w:eastAsia="Times New Roman" w:cs="Times New Roman"/>
-          <w:color w:val="1A1A1A"/>
-          <w:i/>
-          <w:iCs/>
+          <w:i/>
+          <w:iCs/>
+          <w:color w:val="1A1A1A"/>
         </w:rPr>
         <w:t>SPAM</w:t>
       </w:r>
@@ -2438,9 +2474,9 @@
       <w:r>
         <w:rPr>
           <w:rFonts w:eastAsia="Times New Roman" w:cs="Times New Roman"/>
-          <w:color w:val="1A1A1A"/>
-          <w:i/>
-          <w:iCs/>
+          <w:i/>
+          <w:iCs/>
+          <w:color w:val="1A1A1A"/>
         </w:rPr>
         <w:t>KPI</w:t>
       </w:r>
@@ -2454,9 +2490,9 @@
       <w:r>
         <w:rPr>
           <w:rFonts w:eastAsia="Times New Roman" w:cs="Times New Roman"/>
-          <w:color w:val="1A1A1A"/>
-          <w:i/>
-          <w:iCs/>
+          <w:i/>
+          <w:iCs/>
+          <w:color w:val="1A1A1A"/>
         </w:rPr>
         <w:t>SPAM</w:t>
       </w:r>
@@ -2470,9 +2506,9 @@
       <w:r>
         <w:rPr>
           <w:rFonts w:eastAsia="Times New Roman" w:cs="Times New Roman"/>
-          <w:color w:val="1A1A1A"/>
-          <w:i/>
-          <w:iCs/>
+          <w:i/>
+          <w:iCs/>
+          <w:color w:val="1A1A1A"/>
         </w:rPr>
         <w:t>Outcome</w:t>
       </w:r>
@@ -2486,9 +2522,9 @@
       <w:r>
         <w:rPr>
           <w:rFonts w:eastAsia="Times New Roman" w:cs="Times New Roman"/>
-          <w:color w:val="1A1A1A"/>
-          <w:i/>
-          <w:iCs/>
+          <w:i/>
+          <w:iCs/>
+          <w:color w:val="1A1A1A"/>
         </w:rPr>
         <w:t>update</w:t>
       </w:r>
@@ -2497,14 +2533,22 @@
           <w:rFonts w:eastAsia="Times New Roman" w:cs="Times New Roman"/>
           <w:color w:val="1A1A1A"/>
         </w:rPr>
-        <w:t xml:space="preserve"> progres dari titik tengah 21 hari manual menjadi median 12 hari (efisiensi ≈ 42,9%); 29 pengawas / 33 lokasi; 83,9% paket </w:t>
-      </w:r>
-      <w:r>
-        <w:rPr>
-          <w:rFonts w:eastAsia="Times New Roman" w:cs="Times New Roman"/>
-          <w:color w:val="1A1A1A"/>
-          <w:i/>
-          <w:iCs/>
+        <w:t xml:space="preserve"> progres dari titik tengah 21 hari manual menjadi median 12 hari (efisiensi ≈ 42,9%); </w:t>
+      </w:r>
+      <w:r>
+        <w:rPr>
+          <w:rFonts w:eastAsia="Times New Roman" w:cs="Times New Roman"/>
+          <w:color w:val="1A1A1A"/>
+        </w:rPr>
+        <w:lastRenderedPageBreak/>
+        <w:t xml:space="preserve">29 pengawas / 33 lokasi; 83,9% paket </w:t>
+      </w:r>
+      <w:r>
+        <w:rPr>
+          <w:rFonts w:eastAsia="Times New Roman" w:cs="Times New Roman"/>
+          <w:i/>
+          <w:iCs/>
+          <w:color w:val="1A1A1A"/>
         </w:rPr>
         <w:t>progress</w:t>
       </w:r>
@@ -2518,9 +2562,9 @@
       <w:r>
         <w:rPr>
           <w:rFonts w:eastAsia="Times New Roman" w:cs="Times New Roman"/>
-          <w:color w:val="1A1A1A"/>
-          <w:i/>
-          <w:iCs/>
+          <w:i/>
+          <w:iCs/>
+          <w:color w:val="1A1A1A"/>
         </w:rPr>
         <w:t>audit log</w:t>
       </w:r>
@@ -2534,9 +2578,9 @@
       <w:r>
         <w:rPr>
           <w:rFonts w:eastAsia="Times New Roman" w:cs="Times New Roman"/>
-          <w:color w:val="1A1A1A"/>
-          <w:i/>
-          <w:iCs/>
+          <w:i/>
+          <w:iCs/>
+          <w:color w:val="1A1A1A"/>
         </w:rPr>
         <w:t>Outcome</w:t>
       </w:r>
@@ -2550,9 +2594,9 @@
       <w:r>
         <w:rPr>
           <w:rFonts w:eastAsia="Times New Roman" w:cs="Times New Roman"/>
-          <w:color w:val="1A1A1A"/>
-          <w:i/>
-          <w:iCs/>
+          <w:i/>
+          <w:iCs/>
+          <w:color w:val="1A1A1A"/>
         </w:rPr>
         <w:t>gap</w:t>
       </w:r>
@@ -3558,6 +3602,7 @@
   <w:style w:type="character" w:default="1" w:styleId="DefaultParagraphFont">
     <w:name w:val="Default Paragraph Font"/>
     <w:uiPriority w:val="1"/>
+    <w:semiHidden/>
     <w:unhideWhenUsed/>
   </w:style>
   <w:style w:type="table" w:default="1" w:styleId="TableNormal">

</xml_diff>

<commit_message>
feat: update sidebar sp2d-realisasi, berkas, executive-dashboard, docs & templates
</commit_message>
<xml_diff>
--- a/docs/Proposal_Inovasi_Arumanis_LIDA_2026.docx
+++ b/docs/Proposal_Inovasi_Arumanis_LIDA_2026.docx
@@ -2671,8 +2671,18 @@
           <w:p>
             <w:pPr>
               <w:jc w:val="center"/>
+              <w:rPr>
+                <w:b/>
+                <w:bCs/>
+                <w:u w:val="single"/>
+              </w:rPr>
             </w:pPr>
             <w:r>
+              <w:rPr>
+                <w:b/>
+                <w:bCs/>
+                <w:u w:val="single"/>
+              </w:rPr>
               <w:t>CEPI RAHMAT FADIANA, ST, MT</w:t>
             </w:r>
           </w:p>
@@ -2741,8 +2751,18 @@
           <w:p>
             <w:pPr>
               <w:jc w:val="center"/>
+              <w:rPr>
+                <w:b/>
+                <w:bCs/>
+                <w:u w:val="single"/>
+              </w:rPr>
             </w:pPr>
             <w:r>
+              <w:rPr>
+                <w:b/>
+                <w:bCs/>
+                <w:u w:val="single"/>
+              </w:rPr>
               <w:t>ILHAM TAUFIQ</w:t>
             </w:r>
           </w:p>

</xml_diff>